<commit_message>
Declare AI-assisted tools use in cover letter, per MIB guidance
Adds a brief statement to cover.docx, consistent with the full AI
Statement in thesis.qmd, and marks TODO.md item 11 done.

Co-Authored-By: Claude Sonnet 5 <noreply@anthropic.com>
Claude-Session: https://claude.ai/code/session_01Sb8TCK2xpj5DLMacwHuAEw
</commit_message>
<xml_diff>
--- a/thesis_document/cover.docx
+++ b/thesis_document/cover.docx
@@ -306,6 +306,15 @@
           <w:lang w:val="en-US"/>
         </w:rPr>
         <w:t xml:space="preserve"> and it has not been submitted for any other course.</w:t>
+      </w:r>
+    </w:p>
+    <w:p>
+      <w:pPr/>
+      <w:r>
+        <w:rPr>
+          <w:sz w:val="32"/>
+        </w:rPr>
+        <w:t>In accordance with program guidance, I declare that I used AI-assisted tools during the preparation of this thesis: a schema-constrained LLM extractor served as a measurement tool, annotating disclosure text against two human-audited samples, and Anthropic Claude (via Claude Code) served as a coding and editing assistant. All research questions, design choices, interpretations, and conclusions are my own, and I reviewed and approved all reported results.</w:t>
       </w:r>
     </w:p>
     <w:p>

</xml_diff>

<commit_message>
style(thesis): standardize MIB chart typography/color palette and refine executive summary
- Standardize visual system across all empirical charts using unified MIB typography and color palettes.
- Design dedicated ternary plot subpalette with high-contrast sector centroids for the archetype simplex.
- Rebuild expanding-window archetype visuals and credibility design tables.
- Rewrite Executive Summary in executive register and add methodology roadmap in Chapter 1.
</commit_message>
<xml_diff>
--- a/thesis_document/cover.docx
+++ b/thesis_document/cover.docx
@@ -306,6 +306,15 @@
           <w:lang w:val="en-US"/>
         </w:rPr>
         <w:t xml:space="preserve"> and it has not been submitted for any other course.</w:t>
+      </w:r>
+    </w:p>
+    <w:p>
+      <w:pPr/>
+      <w:r>
+        <w:rPr>
+          <w:sz w:val="32"/>
+        </w:rPr>
+        <w:t>In accordance with program guidance, I declare that I used AI-assisted tools during the preparation of this thesis: a schema-constrained LLM extractor served as a measurement tool, annotating disclosure text against two human-audited samples, and Anthropic Claude (via Claude Code) served as a coding and editing assistant. All research questions, design choices, interpretations, and conclusions are my own, and I reviewed and approved all reported results.</w:t>
       </w:r>
     </w:p>
     <w:p>

</xml_diff>

<commit_message>
refactor(thesis): streamline prose, harmonize figures and update methodology structure
- Tighten Executive Summary to fit single page budget
- Explicitly integrate theoretical mechanisms and authors in Section 1.4
- Streamline RQs into single unified table without Chapter column
- Make Figure 2 follow-up text strictly analytical and non-redundant
- Remove inter-model agreement and Cohen's kappa mentions
- Condense k=3 selection and decoupling prose
- Harmonize figure styles and MIB palette for ecosystems and DeepSeek plot
- Shorten notes across figures and tables
</commit_message>
<xml_diff>
--- a/thesis_document/cover.docx
+++ b/thesis_document/cover.docx
@@ -10,7 +10,10 @@
       </w:pPr>
       <w:bookmarkStart w:id="0" w:name="_Toc43964939"/>
       <w:r>
-        <w:pict w14:anchorId="2124F0E3">
+        <w:rPr>
+          <w:noProof/>
+        </w:rPr>
+        <w:pict w14:anchorId="4D4DD1D5">
           <v:shapetype id="_x0000_t75" coordsize="21600,21600" o:spt="75" o:preferrelative="t" path="m@4@5l@4@11@9@11@9@5xe" filled="f" stroked="f">
             <v:stroke joinstyle="miter"/>
             <v:formulas>
@@ -30,7 +33,7 @@
             <v:path o:extrusionok="f" gradientshapeok="t" o:connecttype="rect"/>
             <o:lock v:ext="edit" aspectratio="t"/>
           </v:shapetype>
-          <v:shape id="_x0000_i1025" type="#_x0000_t75" style="width:153.75pt;height:58.5pt">
+          <v:shape id="_x0000_i1025" type="#_x0000_t75" alt="" style="width:153.65pt;height:58.5pt;mso-width-percent:0;mso-height-percent:0;mso-width-percent:0;mso-height-percent:0">
             <v:imagedata r:id="rId12" o:title="new_logo_MIB"/>
           </v:shape>
         </w:pict>
@@ -109,7 +112,7 @@
       <w:r>
         <w:rPr>
           <w:sz w:val="36"/>
-          <w:lang/>
+          <w:lang w:val="en-US"/>
         </w:rPr>
         <w:t>I</w:t>
       </w:r>
@@ -185,7 +188,7 @@
           <w:sz w:val="52"/>
           <w:lang w:val="en-US"/>
         </w:rPr>
-        <w:t xml:space="preserve">AI Washing or Credible Disclosure? Patterns and Clusters in Corporate AI Disclosures</w:t>
+        <w:t>AI Washing or Credible Disclosure? Patterns and Clusters in Corporate AI Disclosures</w:t>
       </w:r>
     </w:p>
     <w:p>
@@ -233,7 +236,7 @@
           <w:sz w:val="36"/>
           <w:lang w:val="en-US"/>
         </w:rPr>
-        <w:t xml:space="preserve">Germán Oviedo</w:t>
+        <w:t>Germán Oviedo</w:t>
       </w:r>
     </w:p>
     <w:p>
@@ -306,15 +309,6 @@
           <w:lang w:val="en-US"/>
         </w:rPr>
         <w:t xml:space="preserve"> and it has not been submitted for any other course.</w:t>
-      </w:r>
-    </w:p>
-    <w:p>
-      <w:pPr/>
-      <w:r>
-        <w:rPr>
-          <w:sz w:val="32"/>
-        </w:rPr>
-        <w:t>In accordance with program guidance, I declare that I used AI-assisted tools during the preparation of this thesis: a schema-constrained LLM extractor served as a measurement tool, annotating disclosure text against two human-audited samples, and Anthropic Claude (via Claude Code) served as a coding and editing assistant. All research questions, design choices, interpretations, and conclusions are my own, and I reviewed and approved all reported results.</w:t>
       </w:r>
     </w:p>
     <w:p>
@@ -399,7 +393,7 @@
 <w:ftr xmlns:wpc="http://schemas.microsoft.com/office/word/2010/wordprocessingCanvas" xmlns:cx="http://schemas.microsoft.com/office/drawing/2014/chartex" xmlns:cx1="http://schemas.microsoft.com/office/drawing/2015/9/8/chartex" xmlns:cx2="http://schemas.microsoft.com/office/drawing/2015/10/21/chartex" xmlns:cx3="http://schemas.microsoft.com/office/drawing/2016/5/9/chartex" xmlns:cx4="http://schemas.microsoft.com/office/drawing/2016/5/10/chartex" xmlns:cx5="http://schemas.microsoft.com/office/drawing/2016/5/11/chartex" xmlns:cx6="http://schemas.microsoft.com/office/drawing/2016/5/12/chartex" xmlns:cx7="http://schemas.microsoft.com/office/drawing/2016/5/13/chartex" xmlns:cx8="http://schemas.microsoft.com/office/drawing/2016/5/14/chartex" xmlns:mc="http://schemas.openxmlformats.org/markup-compatibility/2006" xmlns:aink="http://schemas.microsoft.com/office/drawing/2016/ink" xmlns:am3d="http://schemas.microsoft.com/office/drawing/2017/model3d" xmlns:o="urn:schemas-microsoft-com:office:office" xmlns:oel="http://schemas.microsoft.com/office/2019/extlst" xmlns:r="http://schemas.openxmlformats.org/officeDocument/2006/relationships" xmlns:m="http://schemas.openxmlformats.org/officeDocument/2006/math" xmlns:v="urn:schemas-microsoft-com:vml" xmlns:wp14="http://schemas.microsoft.com/office/word/2010/wordprocessingDrawing" xmlns:wp="http://schemas.openxmlformats.org/drawingml/2006/wordprocessingDrawing" xmlns:w10="urn:schemas-microsoft-com:office:word" xmlns:w="http://schemas.openxmlformats.org/wordprocessingml/2006/main" xmlns:w14="http://schemas.microsoft.com/office/word/2010/wordml" xmlns:w15="http://schemas.microsoft.com/office/word/2012/wordml" xmlns:w16cex="http://schemas.microsoft.com/office/word/2018/wordml/cex" xmlns:w16cid="http://schemas.microsoft.com/office/word/2016/wordml/cid" xmlns:w16="http://schemas.microsoft.com/office/word/2018/wordml" xmlns:w16du="http://schemas.microsoft.com/office/word/2023/wordml/word16du" xmlns:w16sdtdh="http://schemas.microsoft.com/office/word/2020/wordml/sdtdatahash" xmlns:w16sdtfl="http://schemas.microsoft.com/office/word/2024/wordml/sdtformatlock" xmlns:w16se="http://schemas.microsoft.com/office/word/2015/wordml/symex" xmlns:wpg="http://schemas.microsoft.com/office/word/2010/wordprocessingGroup" xmlns:wpi="http://schemas.microsoft.com/office/word/2010/wordprocessingInk" xmlns:wne="http://schemas.microsoft.com/office/word/2006/wordml" xmlns:wps="http://schemas.microsoft.com/office/word/2010/wordprocessingShape" mc:Ignorable="w14 w15 w16se w16cid w16 w16cex w16sdtdh w16sdtfl w16du wp14">
   <w:p>
     <w:pPr>
-      <w:pStyle w:val="Footer"/>
+      <w:pStyle w:val="Piedepgina"/>
       <w:pBdr>
         <w:top w:val="single" w:sz="4" w:space="1" w:color="00897B"/>
       </w:pBdr>
@@ -411,7 +405,7 @@
     </w:pPr>
     <w:r>
       <w:rPr>
-        <w:rStyle w:val="PageNumber"/>
+        <w:rStyle w:val="Nmerodepgina"/>
         <w:b w:val="0"/>
         <w:sz w:val="20"/>
       </w:rPr>
@@ -419,7 +413,7 @@
     </w:r>
     <w:r>
       <w:rPr>
-        <w:rStyle w:val="PageNumber"/>
+        <w:rStyle w:val="Nmerodepgina"/>
         <w:b w:val="0"/>
         <w:sz w:val="20"/>
       </w:rPr>
@@ -427,7 +421,7 @@
     </w:r>
     <w:r>
       <w:rPr>
-        <w:rStyle w:val="PageNumber"/>
+        <w:rStyle w:val="Nmerodepgina"/>
         <w:b w:val="0"/>
         <w:sz w:val="20"/>
       </w:rPr>
@@ -435,7 +429,7 @@
     </w:r>
     <w:r>
       <w:rPr>
-        <w:rStyle w:val="PageNumber"/>
+        <w:rStyle w:val="Nmerodepgina"/>
         <w:b w:val="0"/>
         <w:noProof/>
         <w:sz w:val="20"/>
@@ -444,7 +438,7 @@
     </w:r>
     <w:r>
       <w:rPr>
-        <w:rStyle w:val="PageNumber"/>
+        <w:rStyle w:val="Nmerodepgina"/>
         <w:b w:val="0"/>
         <w:sz w:val="20"/>
       </w:rPr>
@@ -458,7 +452,7 @@
 <w:ftr xmlns:wpc="http://schemas.microsoft.com/office/word/2010/wordprocessingCanvas" xmlns:cx="http://schemas.microsoft.com/office/drawing/2014/chartex" xmlns:cx1="http://schemas.microsoft.com/office/drawing/2015/9/8/chartex" xmlns:cx2="http://schemas.microsoft.com/office/drawing/2015/10/21/chartex" xmlns:cx3="http://schemas.microsoft.com/office/drawing/2016/5/9/chartex" xmlns:cx4="http://schemas.microsoft.com/office/drawing/2016/5/10/chartex" xmlns:cx5="http://schemas.microsoft.com/office/drawing/2016/5/11/chartex" xmlns:cx6="http://schemas.microsoft.com/office/drawing/2016/5/12/chartex" xmlns:cx7="http://schemas.microsoft.com/office/drawing/2016/5/13/chartex" xmlns:cx8="http://schemas.microsoft.com/office/drawing/2016/5/14/chartex" xmlns:mc="http://schemas.openxmlformats.org/markup-compatibility/2006" xmlns:aink="http://schemas.microsoft.com/office/drawing/2016/ink" xmlns:am3d="http://schemas.microsoft.com/office/drawing/2017/model3d" xmlns:o="urn:schemas-microsoft-com:office:office" xmlns:oel="http://schemas.microsoft.com/office/2019/extlst" xmlns:r="http://schemas.openxmlformats.org/officeDocument/2006/relationships" xmlns:m="http://schemas.openxmlformats.org/officeDocument/2006/math" xmlns:v="urn:schemas-microsoft-com:vml" xmlns:wp14="http://schemas.microsoft.com/office/word/2010/wordprocessingDrawing" xmlns:wp="http://schemas.openxmlformats.org/drawingml/2006/wordprocessingDrawing" xmlns:w10="urn:schemas-microsoft-com:office:word" xmlns:w="http://schemas.openxmlformats.org/wordprocessingml/2006/main" xmlns:w14="http://schemas.microsoft.com/office/word/2010/wordml" xmlns:w15="http://schemas.microsoft.com/office/word/2012/wordml" xmlns:w16cex="http://schemas.microsoft.com/office/word/2018/wordml/cex" xmlns:w16cid="http://schemas.microsoft.com/office/word/2016/wordml/cid" xmlns:w16="http://schemas.microsoft.com/office/word/2018/wordml" xmlns:w16du="http://schemas.microsoft.com/office/word/2023/wordml/word16du" xmlns:w16sdtdh="http://schemas.microsoft.com/office/word/2020/wordml/sdtdatahash" xmlns:w16sdtfl="http://schemas.microsoft.com/office/word/2024/wordml/sdtformatlock" xmlns:w16se="http://schemas.microsoft.com/office/word/2015/wordml/symex" xmlns:wpg="http://schemas.microsoft.com/office/word/2010/wordprocessingGroup" xmlns:wpi="http://schemas.microsoft.com/office/word/2010/wordprocessingInk" xmlns:wne="http://schemas.microsoft.com/office/word/2006/wordml" xmlns:wps="http://schemas.microsoft.com/office/word/2010/wordprocessingShape" mc:Ignorable="w14 w15 w16se w16cid w16 w16cex w16sdtdh w16sdtfl w16du wp14">
   <w:p>
     <w:pPr>
-      <w:pStyle w:val="Footer"/>
+      <w:pStyle w:val="Piedepgina"/>
       <w:pBdr>
         <w:top w:val="single" w:sz="4" w:space="1" w:color="00897B"/>
       </w:pBdr>
@@ -469,7 +463,7 @@
     </w:pPr>
     <w:r>
       <w:rPr>
-        <w:rStyle w:val="PageNumber"/>
+        <w:rStyle w:val="Nmerodepgina"/>
         <w:b w:val="0"/>
         <w:sz w:val="20"/>
       </w:rPr>
@@ -477,7 +471,7 @@
     </w:r>
     <w:r>
       <w:rPr>
-        <w:rStyle w:val="PageNumber"/>
+        <w:rStyle w:val="Nmerodepgina"/>
         <w:b w:val="0"/>
         <w:sz w:val="20"/>
       </w:rPr>
@@ -485,7 +479,7 @@
     </w:r>
     <w:r>
       <w:rPr>
-        <w:rStyle w:val="PageNumber"/>
+        <w:rStyle w:val="Nmerodepgina"/>
         <w:b w:val="0"/>
         <w:sz w:val="20"/>
       </w:rPr>
@@ -493,7 +487,7 @@
     </w:r>
     <w:r>
       <w:rPr>
-        <w:rStyle w:val="PageNumber"/>
+        <w:rStyle w:val="Nmerodepgina"/>
         <w:b w:val="0"/>
         <w:noProof/>
         <w:sz w:val="20"/>
@@ -502,7 +496,7 @@
     </w:r>
     <w:r>
       <w:rPr>
-        <w:rStyle w:val="PageNumber"/>
+        <w:rStyle w:val="Nmerodepgina"/>
         <w:b w:val="0"/>
         <w:sz w:val="20"/>
       </w:rPr>
@@ -516,7 +510,7 @@
 <w:ftr xmlns:wpc="http://schemas.microsoft.com/office/word/2010/wordprocessingCanvas" xmlns:cx="http://schemas.microsoft.com/office/drawing/2014/chartex" xmlns:cx1="http://schemas.microsoft.com/office/drawing/2015/9/8/chartex" xmlns:cx2="http://schemas.microsoft.com/office/drawing/2015/10/21/chartex" xmlns:cx3="http://schemas.microsoft.com/office/drawing/2016/5/9/chartex" xmlns:cx4="http://schemas.microsoft.com/office/drawing/2016/5/10/chartex" xmlns:cx5="http://schemas.microsoft.com/office/drawing/2016/5/11/chartex" xmlns:cx6="http://schemas.microsoft.com/office/drawing/2016/5/12/chartex" xmlns:cx7="http://schemas.microsoft.com/office/drawing/2016/5/13/chartex" xmlns:cx8="http://schemas.microsoft.com/office/drawing/2016/5/14/chartex" xmlns:mc="http://schemas.openxmlformats.org/markup-compatibility/2006" xmlns:aink="http://schemas.microsoft.com/office/drawing/2016/ink" xmlns:am3d="http://schemas.microsoft.com/office/drawing/2017/model3d" xmlns:o="urn:schemas-microsoft-com:office:office" xmlns:oel="http://schemas.microsoft.com/office/2019/extlst" xmlns:r="http://schemas.openxmlformats.org/officeDocument/2006/relationships" xmlns:m="http://schemas.openxmlformats.org/officeDocument/2006/math" xmlns:v="urn:schemas-microsoft-com:vml" xmlns:wp14="http://schemas.microsoft.com/office/word/2010/wordprocessingDrawing" xmlns:wp="http://schemas.openxmlformats.org/drawingml/2006/wordprocessingDrawing" xmlns:w10="urn:schemas-microsoft-com:office:word" xmlns:w="http://schemas.openxmlformats.org/wordprocessingml/2006/main" xmlns:w14="http://schemas.microsoft.com/office/word/2010/wordml" xmlns:w15="http://schemas.microsoft.com/office/word/2012/wordml" xmlns:w16cex="http://schemas.microsoft.com/office/word/2018/wordml/cex" xmlns:w16cid="http://schemas.microsoft.com/office/word/2016/wordml/cid" xmlns:w16="http://schemas.microsoft.com/office/word/2018/wordml" xmlns:w16du="http://schemas.microsoft.com/office/word/2023/wordml/word16du" xmlns:w16sdtdh="http://schemas.microsoft.com/office/word/2020/wordml/sdtdatahash" xmlns:w16sdtfl="http://schemas.microsoft.com/office/word/2024/wordml/sdtformatlock" xmlns:w16se="http://schemas.microsoft.com/office/word/2015/wordml/symex" xmlns:wpg="http://schemas.microsoft.com/office/word/2010/wordprocessingGroup" xmlns:wpi="http://schemas.microsoft.com/office/word/2010/wordprocessingInk" xmlns:wne="http://schemas.microsoft.com/office/word/2006/wordml" xmlns:wps="http://schemas.microsoft.com/office/word/2010/wordprocessingShape" mc:Ignorable="w14 w15 w16se w16cid w16 w16cex w16sdtdh w16sdtfl w16du wp14">
   <w:p>
     <w:pPr>
-      <w:pStyle w:val="Footer"/>
+      <w:pStyle w:val="Piedepgina"/>
       <w:pBdr>
         <w:top w:val="none" w:sz="0" w:space="0" w:color="auto"/>
       </w:pBdr>
@@ -1329,7 +1323,7 @@
     <w:lvl w:ilvl="0" w:tplc="38DCD0EA">
       <w:start w:val="1"/>
       <w:numFmt w:val="lowerLetter"/>
-      <w:pStyle w:val="List"/>
+      <w:pStyle w:val="Lista"/>
       <w:lvlText w:val="%1)"/>
       <w:lvlJc w:val="left"/>
       <w:pPr>
@@ -2501,7 +2495,7 @@
     <w:rPrDefault>
       <w:rPr>
         <w:rFonts w:ascii="Calibri" w:eastAsia="Times New Roman" w:hAnsi="Calibri" w:cs="Times New Roman"/>
-        <w:lang w:bidi="ar-SA"/>
+        <w:lang w:val="es-CL" w:eastAsia="es-MX" w:bidi="ar-SA"/>
       </w:rPr>
     </w:rPrDefault>
     <w:pPrDefault/>
@@ -2897,7 +2891,7 @@
       <w:lang w:val="it-IT" w:eastAsia="it-IT"/>
     </w:rPr>
   </w:style>
-  <w:style w:type="paragraph" w:styleId="Heading1">
+  <w:style w:type="paragraph" w:styleId="Ttulo1">
     <w:name w:val="heading 1"/>
     <w:basedOn w:val="Normal"/>
     <w:next w:val="Normal"/>
@@ -2921,7 +2915,7 @@
       <w:szCs w:val="32"/>
     </w:rPr>
   </w:style>
-  <w:style w:type="paragraph" w:styleId="Heading2">
+  <w:style w:type="paragraph" w:styleId="Ttulo2">
     <w:name w:val="heading 2"/>
     <w:basedOn w:val="Normal"/>
     <w:next w:val="Normal"/>
@@ -2945,7 +2939,7 @@
       <w:szCs w:val="28"/>
     </w:rPr>
   </w:style>
-  <w:style w:type="paragraph" w:styleId="Heading3">
+  <w:style w:type="paragraph" w:styleId="Ttulo3">
     <w:name w:val="heading 3"/>
     <w:basedOn w:val="Normal"/>
     <w:next w:val="Normal"/>
@@ -2966,13 +2960,13 @@
       <w:sz w:val="24"/>
     </w:rPr>
   </w:style>
-  <w:style w:type="character" w:default="1" w:styleId="DefaultParagraphFont">
+  <w:style w:type="character" w:default="1" w:styleId="Fuentedeprrafopredeter">
     <w:name w:val="Default Paragraph Font"/>
     <w:uiPriority w:val="1"/>
     <w:semiHidden/>
     <w:unhideWhenUsed/>
   </w:style>
-  <w:style w:type="table" w:default="1" w:styleId="TableNormal">
+  <w:style w:type="table" w:default="1" w:styleId="Tablanormal">
     <w:name w:val="Normal Table"/>
     <w:uiPriority w:val="99"/>
     <w:semiHidden/>
@@ -2987,13 +2981,13 @@
       </w:tblCellMar>
     </w:tblPr>
   </w:style>
-  <w:style w:type="numbering" w:default="1" w:styleId="NoList">
+  <w:style w:type="numbering" w:default="1" w:styleId="Sinlista">
     <w:name w:val="No List"/>
     <w:uiPriority w:val="99"/>
     <w:semiHidden/>
     <w:unhideWhenUsed/>
   </w:style>
-  <w:style w:type="paragraph" w:styleId="FootnoteText">
+  <w:style w:type="paragraph" w:styleId="Textonotapie">
     <w:name w:val="footnote text"/>
     <w:basedOn w:val="Normal"/>
     <w:semiHidden/>
@@ -3010,7 +3004,7 @@
       <w:szCs w:val="16"/>
     </w:rPr>
   </w:style>
-  <w:style w:type="character" w:styleId="FootnoteReference">
+  <w:style w:type="character" w:styleId="Refdenotaalpie">
     <w:name w:val="footnote reference"/>
     <w:semiHidden/>
     <w:rsid w:val="005C0C2C"/>
@@ -3019,7 +3013,7 @@
       <w:vertAlign w:val="superscript"/>
     </w:rPr>
   </w:style>
-  <w:style w:type="paragraph" w:styleId="Header">
+  <w:style w:type="paragraph" w:styleId="Encabezado">
     <w:name w:val="header"/>
     <w:basedOn w:val="Normal"/>
     <w:rsid w:val="00D050FB"/>
@@ -3040,10 +3034,10 @@
       <w:szCs w:val="16"/>
     </w:rPr>
   </w:style>
-  <w:style w:type="paragraph" w:styleId="Footer">
+  <w:style w:type="paragraph" w:styleId="Piedepgina">
     <w:name w:val="footer"/>
-    <w:basedOn w:val="Header"/>
-    <w:link w:val="FooterChar"/>
+    <w:basedOn w:val="Encabezado"/>
+    <w:link w:val="PiedepginaCar"/>
     <w:uiPriority w:val="99"/>
     <w:rsid w:val="005C0C2C"/>
     <w:pPr>
@@ -3056,7 +3050,7 @@
       <w:i w:val="0"/>
     </w:rPr>
   </w:style>
-  <w:style w:type="character" w:styleId="PageNumber">
+  <w:style w:type="character" w:styleId="Nmerodepgina">
     <w:name w:val="page number"/>
     <w:rsid w:val="00B71CAC"/>
     <w:rPr>
@@ -3081,21 +3075,21 @@
   </w:style>
   <w:style w:type="paragraph" w:customStyle="1" w:styleId="Bibligrafia">
     <w:name w:val="Bibligrafia"/>
-    <w:basedOn w:val="BodyText"/>
+    <w:basedOn w:val="Textoindependiente"/>
     <w:rsid w:val="00160BFC"/>
     <w:pPr>
       <w:ind w:left="680" w:hanging="680"/>
     </w:pPr>
   </w:style>
-  <w:style w:type="paragraph" w:styleId="BodyText">
+  <w:style w:type="paragraph" w:styleId="Textoindependiente">
     <w:name w:val="Body Text"/>
     <w:basedOn w:val="Normal"/>
     <w:rsid w:val="00160BFC"/>
   </w:style>
-  <w:style w:type="paragraph" w:styleId="List">
+  <w:style w:type="paragraph" w:styleId="Lista">
     <w:name w:val="List"/>
-    <w:basedOn w:val="BodyText"/>
-    <w:next w:val="BodyText"/>
+    <w:basedOn w:val="Textoindependiente"/>
+    <w:next w:val="Textoindependiente"/>
     <w:rsid w:val="0027116B"/>
     <w:pPr>
       <w:numPr>
@@ -3104,7 +3098,7 @@
       <w:spacing w:after="0"/>
     </w:pPr>
   </w:style>
-  <w:style w:type="paragraph" w:styleId="Caption">
+  <w:style w:type="paragraph" w:styleId="Descripcin">
     <w:name w:val="caption"/>
     <w:basedOn w:val="Normal"/>
     <w:next w:val="Normal"/>
@@ -3122,9 +3116,9 @@
       <w:szCs w:val="18"/>
     </w:rPr>
   </w:style>
-  <w:style w:type="table" w:styleId="TableGrid">
+  <w:style w:type="table" w:styleId="Tablaconcuadrcula">
     <w:name w:val="Table Grid"/>
-    <w:basedOn w:val="TableNormal"/>
+    <w:basedOn w:val="Tablanormal"/>
     <w:rsid w:val="00EF58DF"/>
     <w:pPr>
       <w:spacing w:before="240" w:after="240"/>
@@ -3150,7 +3144,7 @@
       <w:jc w:val="center"/>
     </w:pPr>
   </w:style>
-  <w:style w:type="paragraph" w:styleId="TOC1">
+  <w:style w:type="paragraph" w:styleId="TDC1">
     <w:name w:val="toc 1"/>
     <w:basedOn w:val="Normal"/>
     <w:next w:val="Normal"/>
@@ -3158,7 +3152,7 @@
     <w:semiHidden/>
     <w:rsid w:val="00B3713E"/>
   </w:style>
-  <w:style w:type="paragraph" w:styleId="TOC2">
+  <w:style w:type="paragraph" w:styleId="TDC2">
     <w:name w:val="toc 2"/>
     <w:basedOn w:val="Normal"/>
     <w:next w:val="Normal"/>
@@ -3169,7 +3163,7 @@
       <w:ind w:left="240"/>
     </w:pPr>
   </w:style>
-  <w:style w:type="paragraph" w:styleId="TOC3">
+  <w:style w:type="paragraph" w:styleId="TDC3">
     <w:name w:val="toc 3"/>
     <w:basedOn w:val="Normal"/>
     <w:next w:val="Normal"/>
@@ -3180,7 +3174,7 @@
       <w:ind w:left="480"/>
     </w:pPr>
   </w:style>
-  <w:style w:type="character" w:styleId="Hyperlink">
+  <w:style w:type="character" w:styleId="Hipervnculo">
     <w:name w:val="Hyperlink"/>
     <w:rsid w:val="00B3713E"/>
     <w:rPr>
@@ -3188,7 +3182,7 @@
       <w:u w:val="single"/>
     </w:rPr>
   </w:style>
-  <w:style w:type="paragraph" w:styleId="DocumentMap">
+  <w:style w:type="paragraph" w:styleId="Mapadeldocumento">
     <w:name w:val="Document Map"/>
     <w:basedOn w:val="Normal"/>
     <w:semiHidden/>
@@ -3200,7 +3194,7 @@
       <w:rFonts w:ascii="Tahoma" w:hAnsi="Tahoma" w:cs="Tahoma"/>
     </w:rPr>
   </w:style>
-  <w:style w:type="character" w:styleId="CommentReference">
+  <w:style w:type="character" w:styleId="Refdecomentario">
     <w:name w:val="annotation reference"/>
     <w:semiHidden/>
     <w:rsid w:val="002967AE"/>
@@ -3209,7 +3203,7 @@
       <w:szCs w:val="16"/>
     </w:rPr>
   </w:style>
-  <w:style w:type="paragraph" w:styleId="CommentText">
+  <w:style w:type="paragraph" w:styleId="Textocomentario">
     <w:name w:val="annotation text"/>
     <w:basedOn w:val="Normal"/>
     <w:semiHidden/>
@@ -3218,10 +3212,10 @@
       <w:sz w:val="20"/>
     </w:rPr>
   </w:style>
-  <w:style w:type="paragraph" w:styleId="CommentSubject">
+  <w:style w:type="paragraph" w:styleId="Asuntodelcomentario">
     <w:name w:val="annotation subject"/>
-    <w:basedOn w:val="CommentText"/>
-    <w:next w:val="CommentText"/>
+    <w:basedOn w:val="Textocomentario"/>
+    <w:next w:val="Textocomentario"/>
     <w:semiHidden/>
     <w:rsid w:val="002967AE"/>
     <w:rPr>
@@ -3229,7 +3223,7 @@
       <w:bCs/>
     </w:rPr>
   </w:style>
-  <w:style w:type="paragraph" w:styleId="BalloonText">
+  <w:style w:type="paragraph" w:styleId="Textodeglobo">
     <w:name w:val="Balloon Text"/>
     <w:basedOn w:val="Normal"/>
     <w:semiHidden/>
@@ -3240,9 +3234,9 @@
       <w:szCs w:val="16"/>
     </w:rPr>
   </w:style>
-  <w:style w:type="character" w:customStyle="1" w:styleId="FooterChar">
-    <w:name w:val="Footer Char"/>
-    <w:link w:val="Footer"/>
+  <w:style w:type="character" w:customStyle="1" w:styleId="PiedepginaCar">
+    <w:name w:val="Pie de página Car"/>
+    <w:link w:val="Piedepgina"/>
     <w:uiPriority w:val="99"/>
     <w:rsid w:val="00242CFA"/>
     <w:rPr>
@@ -3549,6 +3543,19 @@
 </file>
 
 <file path=customXml/item1.xml><?xml version="1.0" encoding="utf-8"?>
+<LongProperties xmlns="http://schemas.microsoft.com/office/2006/metadata/longProperties"/>
+</file>
+
+<file path=customXml/item2.xml><?xml version="1.0" encoding="utf-8"?>
+<?mso-contentType ?>
+<FormTemplates xmlns="http://schemas.microsoft.com/sharepoint/v3/contenttype/forms">
+  <Display>DocumentLibraryForm</Display>
+  <Edit>DocumentLibraryForm</Edit>
+  <New>DocumentLibraryForm</New>
+</FormTemplates>
+</file>
+
+<file path=customXml/item3.xml><?xml version="1.0" encoding="utf-8"?>
 <ct:contentTypeSchema xmlns:ct="http://schemas.microsoft.com/office/2006/metadata/contentType" xmlns:ma="http://schemas.microsoft.com/office/2006/metadata/properties/metaAttributes" ct:_="" ma:_="" ma:contentTypeName="Document" ma:contentTypeID="0x0101009EB496C08DAE1E4792BCB520C527A294" ma:contentTypeVersion="18" ma:contentTypeDescription="Create a new document." ma:contentTypeScope="" ma:versionID="f58bb6df52ce31facc6af1ae7599759a">
   <xsd:schema xmlns:xsd="http://www.w3.org/2001/XMLSchema" xmlns:xs="http://www.w3.org/2001/XMLSchema" xmlns:p="http://schemas.microsoft.com/office/2006/metadata/properties" xmlns:ns2="688f75fd-8c97-41b8-885e-8aea2f6a00ca" xmlns:ns3="eb539923-acac-4a68-813d-22805dc086c8" targetNamespace="http://schemas.microsoft.com/office/2006/metadata/properties" ma:root="true" ma:fieldsID="f75cb6630f7e0a71166280b4fb5f68cf" ns2:_="" ns3:_="">
     <xsd:import namespace="688f75fd-8c97-41b8-885e-8aea2f6a00ca"/>
@@ -3797,20 +3804,11 @@
 </ct:contentTypeSchema>
 </file>
 
-<file path=customXml/item2.xml><?xml version="1.0" encoding="utf-8"?>
-<?mso-contentType ?>
-<FormTemplates xmlns="http://schemas.microsoft.com/sharepoint/v3/contenttype/forms">
-  <Display>DocumentLibraryForm</Display>
-  <Edit>DocumentLibraryForm</Edit>
-  <New>DocumentLibraryForm</New>
-</FormTemplates>
+<file path=customXml/item4.xml><?xml version="1.0" encoding="utf-8"?>
+<b:Sources xmlns:b="http://schemas.openxmlformats.org/officeDocument/2006/bibliography" xmlns="http://schemas.openxmlformats.org/officeDocument/2006/bibliography" SelectedStyle="\APA.XSL" StyleName="APA"/>
 </file>
 
-<file path=customXml/item3.xml><?xml version="1.0" encoding="utf-8"?>
-<LongProperties xmlns="http://schemas.microsoft.com/office/2006/metadata/longProperties"/>
-</file>
-
-<file path=customXml/item4.xml><?xml version="1.0" encoding="utf-8"?>
+<file path=customXml/item5.xml><?xml version="1.0" encoding="utf-8"?>
 <p:properties xmlns:p="http://schemas.microsoft.com/office/2006/metadata/properties" xmlns:xsi="http://www.w3.org/2001/XMLSchema-instance" xmlns:pc="http://schemas.microsoft.com/office/infopath/2007/PartnerControls">
   <documentManagement>
     <TaxCatchAll xmlns="eb539923-acac-4a68-813d-22805dc086c8" xsi:nil="true"/>
@@ -3821,11 +3819,23 @@
 </p:properties>
 </file>
 
-<file path=customXml/item5.xml><?xml version="1.0" encoding="utf-8"?>
-<b:Sources xmlns:b="http://schemas.openxmlformats.org/officeDocument/2006/bibliography" xmlns="http://schemas.openxmlformats.org/officeDocument/2006/bibliography" SelectedStyle="\APA.XSL" StyleName="APA"/>
+<file path=customXml/itemProps1.xml><?xml version="1.0" encoding="utf-8"?>
+<ds:datastoreItem xmlns:ds="http://schemas.openxmlformats.org/officeDocument/2006/customXml" ds:itemID="{1D62ADE8-C734-4452-9470-0E8B4CA3F6A9}">
+  <ds:schemaRefs>
+    <ds:schemaRef ds:uri="http://schemas.microsoft.com/office/2006/metadata/longProperties"/>
+  </ds:schemaRefs>
+</ds:datastoreItem>
 </file>
 
-<file path=customXml/itemProps1.xml><?xml version="1.0" encoding="utf-8"?>
+<file path=customXml/itemProps2.xml><?xml version="1.0" encoding="utf-8"?>
+<ds:datastoreItem xmlns:ds="http://schemas.openxmlformats.org/officeDocument/2006/customXml" ds:itemID="{78ADCAA9-3277-4515-BBD5-3E9385DB0470}">
+  <ds:schemaRefs>
+    <ds:schemaRef ds:uri="http://schemas.microsoft.com/sharepoint/v3/contenttype/forms"/>
+  </ds:schemaRefs>
+</ds:datastoreItem>
+</file>
+
+<file path=customXml/itemProps3.xml><?xml version="1.0" encoding="utf-8"?>
 <ds:datastoreItem xmlns:ds="http://schemas.openxmlformats.org/officeDocument/2006/customXml" ds:itemID="{57A465C2-CB92-4BE1-9FF3-8C0D07A6038D}">
   <ds:schemaRefs>
     <ds:schemaRef ds:uri="http://schemas.microsoft.com/office/2006/metadata/contentType"/>
@@ -3844,23 +3854,15 @@
 </ds:datastoreItem>
 </file>
 
-<file path=customXml/itemProps2.xml><?xml version="1.0" encoding="utf-8"?>
-<ds:datastoreItem xmlns:ds="http://schemas.openxmlformats.org/officeDocument/2006/customXml" ds:itemID="{78ADCAA9-3277-4515-BBD5-3E9385DB0470}">
+<file path=customXml/itemProps4.xml><?xml version="1.0" encoding="utf-8"?>
+<ds:datastoreItem xmlns:ds="http://schemas.openxmlformats.org/officeDocument/2006/customXml" ds:itemID="{D23F5D7D-106B-470D-A3EB-DB83EBC2F651}">
   <ds:schemaRefs>
-    <ds:schemaRef ds:uri="http://schemas.microsoft.com/sharepoint/v3/contenttype/forms"/>
+    <ds:schemaRef ds:uri="http://schemas.openxmlformats.org/officeDocument/2006/bibliography"/>
   </ds:schemaRefs>
 </ds:datastoreItem>
 </file>
 
-<file path=customXml/itemProps3.xml><?xml version="1.0" encoding="utf-8"?>
-<ds:datastoreItem xmlns:ds="http://schemas.openxmlformats.org/officeDocument/2006/customXml" ds:itemID="{1D62ADE8-C734-4452-9470-0E8B4CA3F6A9}">
-  <ds:schemaRefs>
-    <ds:schemaRef ds:uri="http://schemas.microsoft.com/office/2006/metadata/longProperties"/>
-  </ds:schemaRefs>
-</ds:datastoreItem>
-</file>
-
-<file path=customXml/itemProps4.xml><?xml version="1.0" encoding="utf-8"?>
+<file path=customXml/itemProps5.xml><?xml version="1.0" encoding="utf-8"?>
 <ds:datastoreItem xmlns:ds="http://schemas.openxmlformats.org/officeDocument/2006/customXml" ds:itemID="{7AE3C1EB-CBB7-4F60-8CFA-417199EE669D}">
   <ds:schemaRefs>
     <ds:schemaRef ds:uri="http://schemas.microsoft.com/office/2006/metadata/properties"/>
@@ -3869,12 +3871,4 @@
     <ds:schemaRef ds:uri="688f75fd-8c97-41b8-885e-8aea2f6a00ca"/>
   </ds:schemaRefs>
 </ds:datastoreItem>
-</file>
-
-<file path=customXml/itemProps5.xml><?xml version="1.0" encoding="utf-8"?>
-<ds:datastoreItem xmlns:ds="http://schemas.openxmlformats.org/officeDocument/2006/customXml" ds:itemID="{D23F5D7D-106B-470D-A3EB-DB83EBC2F651}">
-  <ds:schemaRefs>
-    <ds:schemaRef ds:uri="http://schemas.openxmlformats.org/officeDocument/2006/bibliography"/>
-  </ds:schemaRefs>
-</ds:datastoreItem>
 </file>
</xml_diff>

<commit_message>
refactor(thesis): polish prose, harmonize empirical figures, and refine chapter analyses
- Comprehensive prose and style polish across Chapters 1-7 and Appendices A-F.
- Harmonize figure typography, color palettes, and table styling across empirical chapters and appendix exhibits.
- Refine empirical analyses: call-filing channel gap confidence intervals, trailing-twelve-month accounting outcomes, and DeepSeek monthly episode weighting.
- Add Hugging Face dataset synchronization script and migrate interactive validator into dedicated apps package.
</commit_message>
<xml_diff>
--- a/thesis_document/cover.docx
+++ b/thesis_document/cover.docx
@@ -10,7 +10,10 @@
       </w:pPr>
       <w:bookmarkStart w:id="0" w:name="_Toc43964939"/>
       <w:r>
-        <w:pict w14:anchorId="2124F0E3">
+        <w:rPr>
+          <w:noProof/>
+        </w:rPr>
+        <w:pict w14:anchorId="4D4DD1D5">
           <v:shapetype id="_x0000_t75" coordsize="21600,21600" o:spt="75" o:preferrelative="t" path="m@4@5l@4@11@9@11@9@5xe" filled="f" stroked="f">
             <v:stroke joinstyle="miter"/>
             <v:formulas>
@@ -30,7 +33,7 @@
             <v:path o:extrusionok="f" gradientshapeok="t" o:connecttype="rect"/>
             <o:lock v:ext="edit" aspectratio="t"/>
           </v:shapetype>
-          <v:shape id="_x0000_i1025" type="#_x0000_t75" style="width:153.75pt;height:58.5pt">
+          <v:shape id="_x0000_i1025" type="#_x0000_t75" alt="" style="width:153.65pt;height:58.5pt;mso-width-percent:0;mso-height-percent:0;mso-width-percent:0;mso-height-percent:0">
             <v:imagedata r:id="rId12" o:title="new_logo_MIB"/>
           </v:shape>
         </w:pict>
@@ -109,7 +112,7 @@
       <w:r>
         <w:rPr>
           <w:sz w:val="36"/>
-          <w:lang/>
+          <w:lang w:val="en-US"/>
         </w:rPr>
         <w:t>I</w:t>
       </w:r>
@@ -185,7 +188,7 @@
           <w:sz w:val="52"/>
           <w:lang w:val="en-US"/>
         </w:rPr>
-        <w:t xml:space="preserve">AI Washing or Credible Disclosure? Patterns and Clusters in Corporate AI Disclosures</w:t>
+        <w:t>AI Washing or Credible Disclosure? Patterns and Clusters in Corporate AI Disclosures</w:t>
       </w:r>
     </w:p>
     <w:p>
@@ -233,7 +236,7 @@
           <w:sz w:val="36"/>
           <w:lang w:val="en-US"/>
         </w:rPr>
-        <w:t xml:space="preserve">Germán Oviedo</w:t>
+        <w:t>Germán Oviedo</w:t>
       </w:r>
     </w:p>
     <w:p>
@@ -306,15 +309,6 @@
           <w:lang w:val="en-US"/>
         </w:rPr>
         <w:t xml:space="preserve"> and it has not been submitted for any other course.</w:t>
-      </w:r>
-    </w:p>
-    <w:p>
-      <w:pPr/>
-      <w:r>
-        <w:rPr>
-          <w:sz w:val="32"/>
-        </w:rPr>
-        <w:t>In accordance with program guidance, I declare that I used AI-assisted tools during the preparation of this thesis: a schema-constrained LLM extractor served as a measurement tool, annotating disclosure text against two human-audited samples, and Anthropic Claude (via Claude Code) served as a coding and editing assistant. All research questions, design choices, interpretations, and conclusions are my own, and I reviewed and approved all reported results.</w:t>
       </w:r>
     </w:p>
     <w:p>
@@ -399,7 +393,7 @@
 <w:ftr xmlns:wpc="http://schemas.microsoft.com/office/word/2010/wordprocessingCanvas" xmlns:cx="http://schemas.microsoft.com/office/drawing/2014/chartex" xmlns:cx1="http://schemas.microsoft.com/office/drawing/2015/9/8/chartex" xmlns:cx2="http://schemas.microsoft.com/office/drawing/2015/10/21/chartex" xmlns:cx3="http://schemas.microsoft.com/office/drawing/2016/5/9/chartex" xmlns:cx4="http://schemas.microsoft.com/office/drawing/2016/5/10/chartex" xmlns:cx5="http://schemas.microsoft.com/office/drawing/2016/5/11/chartex" xmlns:cx6="http://schemas.microsoft.com/office/drawing/2016/5/12/chartex" xmlns:cx7="http://schemas.microsoft.com/office/drawing/2016/5/13/chartex" xmlns:cx8="http://schemas.microsoft.com/office/drawing/2016/5/14/chartex" xmlns:mc="http://schemas.openxmlformats.org/markup-compatibility/2006" xmlns:aink="http://schemas.microsoft.com/office/drawing/2016/ink" xmlns:am3d="http://schemas.microsoft.com/office/drawing/2017/model3d" xmlns:o="urn:schemas-microsoft-com:office:office" xmlns:oel="http://schemas.microsoft.com/office/2019/extlst" xmlns:r="http://schemas.openxmlformats.org/officeDocument/2006/relationships" xmlns:m="http://schemas.openxmlformats.org/officeDocument/2006/math" xmlns:v="urn:schemas-microsoft-com:vml" xmlns:wp14="http://schemas.microsoft.com/office/word/2010/wordprocessingDrawing" xmlns:wp="http://schemas.openxmlformats.org/drawingml/2006/wordprocessingDrawing" xmlns:w10="urn:schemas-microsoft-com:office:word" xmlns:w="http://schemas.openxmlformats.org/wordprocessingml/2006/main" xmlns:w14="http://schemas.microsoft.com/office/word/2010/wordml" xmlns:w15="http://schemas.microsoft.com/office/word/2012/wordml" xmlns:w16cex="http://schemas.microsoft.com/office/word/2018/wordml/cex" xmlns:w16cid="http://schemas.microsoft.com/office/word/2016/wordml/cid" xmlns:w16="http://schemas.microsoft.com/office/word/2018/wordml" xmlns:w16du="http://schemas.microsoft.com/office/word/2023/wordml/word16du" xmlns:w16sdtdh="http://schemas.microsoft.com/office/word/2020/wordml/sdtdatahash" xmlns:w16sdtfl="http://schemas.microsoft.com/office/word/2024/wordml/sdtformatlock" xmlns:w16se="http://schemas.microsoft.com/office/word/2015/wordml/symex" xmlns:wpg="http://schemas.microsoft.com/office/word/2010/wordprocessingGroup" xmlns:wpi="http://schemas.microsoft.com/office/word/2010/wordprocessingInk" xmlns:wne="http://schemas.microsoft.com/office/word/2006/wordml" xmlns:wps="http://schemas.microsoft.com/office/word/2010/wordprocessingShape" mc:Ignorable="w14 w15 w16se w16cid w16 w16cex w16sdtdh w16sdtfl w16du wp14">
   <w:p>
     <w:pPr>
-      <w:pStyle w:val="Footer"/>
+      <w:pStyle w:val="Piedepgina"/>
       <w:pBdr>
         <w:top w:val="single" w:sz="4" w:space="1" w:color="00897B"/>
       </w:pBdr>
@@ -411,7 +405,7 @@
     </w:pPr>
     <w:r>
       <w:rPr>
-        <w:rStyle w:val="PageNumber"/>
+        <w:rStyle w:val="Nmerodepgina"/>
         <w:b w:val="0"/>
         <w:sz w:val="20"/>
       </w:rPr>
@@ -419,7 +413,7 @@
     </w:r>
     <w:r>
       <w:rPr>
-        <w:rStyle w:val="PageNumber"/>
+        <w:rStyle w:val="Nmerodepgina"/>
         <w:b w:val="0"/>
         <w:sz w:val="20"/>
       </w:rPr>
@@ -427,7 +421,7 @@
     </w:r>
     <w:r>
       <w:rPr>
-        <w:rStyle w:val="PageNumber"/>
+        <w:rStyle w:val="Nmerodepgina"/>
         <w:b w:val="0"/>
         <w:sz w:val="20"/>
       </w:rPr>
@@ -435,7 +429,7 @@
     </w:r>
     <w:r>
       <w:rPr>
-        <w:rStyle w:val="PageNumber"/>
+        <w:rStyle w:val="Nmerodepgina"/>
         <w:b w:val="0"/>
         <w:noProof/>
         <w:sz w:val="20"/>
@@ -444,7 +438,7 @@
     </w:r>
     <w:r>
       <w:rPr>
-        <w:rStyle w:val="PageNumber"/>
+        <w:rStyle w:val="Nmerodepgina"/>
         <w:b w:val="0"/>
         <w:sz w:val="20"/>
       </w:rPr>
@@ -458,7 +452,7 @@
 <w:ftr xmlns:wpc="http://schemas.microsoft.com/office/word/2010/wordprocessingCanvas" xmlns:cx="http://schemas.microsoft.com/office/drawing/2014/chartex" xmlns:cx1="http://schemas.microsoft.com/office/drawing/2015/9/8/chartex" xmlns:cx2="http://schemas.microsoft.com/office/drawing/2015/10/21/chartex" xmlns:cx3="http://schemas.microsoft.com/office/drawing/2016/5/9/chartex" xmlns:cx4="http://schemas.microsoft.com/office/drawing/2016/5/10/chartex" xmlns:cx5="http://schemas.microsoft.com/office/drawing/2016/5/11/chartex" xmlns:cx6="http://schemas.microsoft.com/office/drawing/2016/5/12/chartex" xmlns:cx7="http://schemas.microsoft.com/office/drawing/2016/5/13/chartex" xmlns:cx8="http://schemas.microsoft.com/office/drawing/2016/5/14/chartex" xmlns:mc="http://schemas.openxmlformats.org/markup-compatibility/2006" xmlns:aink="http://schemas.microsoft.com/office/drawing/2016/ink" xmlns:am3d="http://schemas.microsoft.com/office/drawing/2017/model3d" xmlns:o="urn:schemas-microsoft-com:office:office" xmlns:oel="http://schemas.microsoft.com/office/2019/extlst" xmlns:r="http://schemas.openxmlformats.org/officeDocument/2006/relationships" xmlns:m="http://schemas.openxmlformats.org/officeDocument/2006/math" xmlns:v="urn:schemas-microsoft-com:vml" xmlns:wp14="http://schemas.microsoft.com/office/word/2010/wordprocessingDrawing" xmlns:wp="http://schemas.openxmlformats.org/drawingml/2006/wordprocessingDrawing" xmlns:w10="urn:schemas-microsoft-com:office:word" xmlns:w="http://schemas.openxmlformats.org/wordprocessingml/2006/main" xmlns:w14="http://schemas.microsoft.com/office/word/2010/wordml" xmlns:w15="http://schemas.microsoft.com/office/word/2012/wordml" xmlns:w16cex="http://schemas.microsoft.com/office/word/2018/wordml/cex" xmlns:w16cid="http://schemas.microsoft.com/office/word/2016/wordml/cid" xmlns:w16="http://schemas.microsoft.com/office/word/2018/wordml" xmlns:w16du="http://schemas.microsoft.com/office/word/2023/wordml/word16du" xmlns:w16sdtdh="http://schemas.microsoft.com/office/word/2020/wordml/sdtdatahash" xmlns:w16sdtfl="http://schemas.microsoft.com/office/word/2024/wordml/sdtformatlock" xmlns:w16se="http://schemas.microsoft.com/office/word/2015/wordml/symex" xmlns:wpg="http://schemas.microsoft.com/office/word/2010/wordprocessingGroup" xmlns:wpi="http://schemas.microsoft.com/office/word/2010/wordprocessingInk" xmlns:wne="http://schemas.microsoft.com/office/word/2006/wordml" xmlns:wps="http://schemas.microsoft.com/office/word/2010/wordprocessingShape" mc:Ignorable="w14 w15 w16se w16cid w16 w16cex w16sdtdh w16sdtfl w16du wp14">
   <w:p>
     <w:pPr>
-      <w:pStyle w:val="Footer"/>
+      <w:pStyle w:val="Piedepgina"/>
       <w:pBdr>
         <w:top w:val="single" w:sz="4" w:space="1" w:color="00897B"/>
       </w:pBdr>
@@ -469,7 +463,7 @@
     </w:pPr>
     <w:r>
       <w:rPr>
-        <w:rStyle w:val="PageNumber"/>
+        <w:rStyle w:val="Nmerodepgina"/>
         <w:b w:val="0"/>
         <w:sz w:val="20"/>
       </w:rPr>
@@ -477,7 +471,7 @@
     </w:r>
     <w:r>
       <w:rPr>
-        <w:rStyle w:val="PageNumber"/>
+        <w:rStyle w:val="Nmerodepgina"/>
         <w:b w:val="0"/>
         <w:sz w:val="20"/>
       </w:rPr>
@@ -485,7 +479,7 @@
     </w:r>
     <w:r>
       <w:rPr>
-        <w:rStyle w:val="PageNumber"/>
+        <w:rStyle w:val="Nmerodepgina"/>
         <w:b w:val="0"/>
         <w:sz w:val="20"/>
       </w:rPr>
@@ -493,7 +487,7 @@
     </w:r>
     <w:r>
       <w:rPr>
-        <w:rStyle w:val="PageNumber"/>
+        <w:rStyle w:val="Nmerodepgina"/>
         <w:b w:val="0"/>
         <w:noProof/>
         <w:sz w:val="20"/>
@@ -502,7 +496,7 @@
     </w:r>
     <w:r>
       <w:rPr>
-        <w:rStyle w:val="PageNumber"/>
+        <w:rStyle w:val="Nmerodepgina"/>
         <w:b w:val="0"/>
         <w:sz w:val="20"/>
       </w:rPr>
@@ -516,7 +510,7 @@
 <w:ftr xmlns:wpc="http://schemas.microsoft.com/office/word/2010/wordprocessingCanvas" xmlns:cx="http://schemas.microsoft.com/office/drawing/2014/chartex" xmlns:cx1="http://schemas.microsoft.com/office/drawing/2015/9/8/chartex" xmlns:cx2="http://schemas.microsoft.com/office/drawing/2015/10/21/chartex" xmlns:cx3="http://schemas.microsoft.com/office/drawing/2016/5/9/chartex" xmlns:cx4="http://schemas.microsoft.com/office/drawing/2016/5/10/chartex" xmlns:cx5="http://schemas.microsoft.com/office/drawing/2016/5/11/chartex" xmlns:cx6="http://schemas.microsoft.com/office/drawing/2016/5/12/chartex" xmlns:cx7="http://schemas.microsoft.com/office/drawing/2016/5/13/chartex" xmlns:cx8="http://schemas.microsoft.com/office/drawing/2016/5/14/chartex" xmlns:mc="http://schemas.openxmlformats.org/markup-compatibility/2006" xmlns:aink="http://schemas.microsoft.com/office/drawing/2016/ink" xmlns:am3d="http://schemas.microsoft.com/office/drawing/2017/model3d" xmlns:o="urn:schemas-microsoft-com:office:office" xmlns:oel="http://schemas.microsoft.com/office/2019/extlst" xmlns:r="http://schemas.openxmlformats.org/officeDocument/2006/relationships" xmlns:m="http://schemas.openxmlformats.org/officeDocument/2006/math" xmlns:v="urn:schemas-microsoft-com:vml" xmlns:wp14="http://schemas.microsoft.com/office/word/2010/wordprocessingDrawing" xmlns:wp="http://schemas.openxmlformats.org/drawingml/2006/wordprocessingDrawing" xmlns:w10="urn:schemas-microsoft-com:office:word" xmlns:w="http://schemas.openxmlformats.org/wordprocessingml/2006/main" xmlns:w14="http://schemas.microsoft.com/office/word/2010/wordml" xmlns:w15="http://schemas.microsoft.com/office/word/2012/wordml" xmlns:w16cex="http://schemas.microsoft.com/office/word/2018/wordml/cex" xmlns:w16cid="http://schemas.microsoft.com/office/word/2016/wordml/cid" xmlns:w16="http://schemas.microsoft.com/office/word/2018/wordml" xmlns:w16du="http://schemas.microsoft.com/office/word/2023/wordml/word16du" xmlns:w16sdtdh="http://schemas.microsoft.com/office/word/2020/wordml/sdtdatahash" xmlns:w16sdtfl="http://schemas.microsoft.com/office/word/2024/wordml/sdtformatlock" xmlns:w16se="http://schemas.microsoft.com/office/word/2015/wordml/symex" xmlns:wpg="http://schemas.microsoft.com/office/word/2010/wordprocessingGroup" xmlns:wpi="http://schemas.microsoft.com/office/word/2010/wordprocessingInk" xmlns:wne="http://schemas.microsoft.com/office/word/2006/wordml" xmlns:wps="http://schemas.microsoft.com/office/word/2010/wordprocessingShape" mc:Ignorable="w14 w15 w16se w16cid w16 w16cex w16sdtdh w16sdtfl w16du wp14">
   <w:p>
     <w:pPr>
-      <w:pStyle w:val="Footer"/>
+      <w:pStyle w:val="Piedepgina"/>
       <w:pBdr>
         <w:top w:val="none" w:sz="0" w:space="0" w:color="auto"/>
       </w:pBdr>
@@ -1329,7 +1323,7 @@
     <w:lvl w:ilvl="0" w:tplc="38DCD0EA">
       <w:start w:val="1"/>
       <w:numFmt w:val="lowerLetter"/>
-      <w:pStyle w:val="List"/>
+      <w:pStyle w:val="Lista"/>
       <w:lvlText w:val="%1)"/>
       <w:lvlJc w:val="left"/>
       <w:pPr>
@@ -2501,7 +2495,7 @@
     <w:rPrDefault>
       <w:rPr>
         <w:rFonts w:ascii="Calibri" w:eastAsia="Times New Roman" w:hAnsi="Calibri" w:cs="Times New Roman"/>
-        <w:lang w:bidi="ar-SA"/>
+        <w:lang w:val="es-CL" w:eastAsia="es-MX" w:bidi="ar-SA"/>
       </w:rPr>
     </w:rPrDefault>
     <w:pPrDefault/>
@@ -2897,7 +2891,7 @@
       <w:lang w:val="it-IT" w:eastAsia="it-IT"/>
     </w:rPr>
   </w:style>
-  <w:style w:type="paragraph" w:styleId="Heading1">
+  <w:style w:type="paragraph" w:styleId="Ttulo1">
     <w:name w:val="heading 1"/>
     <w:basedOn w:val="Normal"/>
     <w:next w:val="Normal"/>
@@ -2921,7 +2915,7 @@
       <w:szCs w:val="32"/>
     </w:rPr>
   </w:style>
-  <w:style w:type="paragraph" w:styleId="Heading2">
+  <w:style w:type="paragraph" w:styleId="Ttulo2">
     <w:name w:val="heading 2"/>
     <w:basedOn w:val="Normal"/>
     <w:next w:val="Normal"/>
@@ -2945,7 +2939,7 @@
       <w:szCs w:val="28"/>
     </w:rPr>
   </w:style>
-  <w:style w:type="paragraph" w:styleId="Heading3">
+  <w:style w:type="paragraph" w:styleId="Ttulo3">
     <w:name w:val="heading 3"/>
     <w:basedOn w:val="Normal"/>
     <w:next w:val="Normal"/>
@@ -2966,13 +2960,13 @@
       <w:sz w:val="24"/>
     </w:rPr>
   </w:style>
-  <w:style w:type="character" w:default="1" w:styleId="DefaultParagraphFont">
+  <w:style w:type="character" w:default="1" w:styleId="Fuentedeprrafopredeter">
     <w:name w:val="Default Paragraph Font"/>
     <w:uiPriority w:val="1"/>
     <w:semiHidden/>
     <w:unhideWhenUsed/>
   </w:style>
-  <w:style w:type="table" w:default="1" w:styleId="TableNormal">
+  <w:style w:type="table" w:default="1" w:styleId="Tablanormal">
     <w:name w:val="Normal Table"/>
     <w:uiPriority w:val="99"/>
     <w:semiHidden/>
@@ -2987,13 +2981,13 @@
       </w:tblCellMar>
     </w:tblPr>
   </w:style>
-  <w:style w:type="numbering" w:default="1" w:styleId="NoList">
+  <w:style w:type="numbering" w:default="1" w:styleId="Sinlista">
     <w:name w:val="No List"/>
     <w:uiPriority w:val="99"/>
     <w:semiHidden/>
     <w:unhideWhenUsed/>
   </w:style>
-  <w:style w:type="paragraph" w:styleId="FootnoteText">
+  <w:style w:type="paragraph" w:styleId="Textonotapie">
     <w:name w:val="footnote text"/>
     <w:basedOn w:val="Normal"/>
     <w:semiHidden/>
@@ -3010,7 +3004,7 @@
       <w:szCs w:val="16"/>
     </w:rPr>
   </w:style>
-  <w:style w:type="character" w:styleId="FootnoteReference">
+  <w:style w:type="character" w:styleId="Refdenotaalpie">
     <w:name w:val="footnote reference"/>
     <w:semiHidden/>
     <w:rsid w:val="005C0C2C"/>
@@ -3019,7 +3013,7 @@
       <w:vertAlign w:val="superscript"/>
     </w:rPr>
   </w:style>
-  <w:style w:type="paragraph" w:styleId="Header">
+  <w:style w:type="paragraph" w:styleId="Encabezado">
     <w:name w:val="header"/>
     <w:basedOn w:val="Normal"/>
     <w:rsid w:val="00D050FB"/>
@@ -3040,10 +3034,10 @@
       <w:szCs w:val="16"/>
     </w:rPr>
   </w:style>
-  <w:style w:type="paragraph" w:styleId="Footer">
+  <w:style w:type="paragraph" w:styleId="Piedepgina">
     <w:name w:val="footer"/>
-    <w:basedOn w:val="Header"/>
-    <w:link w:val="FooterChar"/>
+    <w:basedOn w:val="Encabezado"/>
+    <w:link w:val="PiedepginaCar"/>
     <w:uiPriority w:val="99"/>
     <w:rsid w:val="005C0C2C"/>
     <w:pPr>
@@ -3056,7 +3050,7 @@
       <w:i w:val="0"/>
     </w:rPr>
   </w:style>
-  <w:style w:type="character" w:styleId="PageNumber">
+  <w:style w:type="character" w:styleId="Nmerodepgina">
     <w:name w:val="page number"/>
     <w:rsid w:val="00B71CAC"/>
     <w:rPr>
@@ -3081,21 +3075,21 @@
   </w:style>
   <w:style w:type="paragraph" w:customStyle="1" w:styleId="Bibligrafia">
     <w:name w:val="Bibligrafia"/>
-    <w:basedOn w:val="BodyText"/>
+    <w:basedOn w:val="Textoindependiente"/>
     <w:rsid w:val="00160BFC"/>
     <w:pPr>
       <w:ind w:left="680" w:hanging="680"/>
     </w:pPr>
   </w:style>
-  <w:style w:type="paragraph" w:styleId="BodyText">
+  <w:style w:type="paragraph" w:styleId="Textoindependiente">
     <w:name w:val="Body Text"/>
     <w:basedOn w:val="Normal"/>
     <w:rsid w:val="00160BFC"/>
   </w:style>
-  <w:style w:type="paragraph" w:styleId="List">
+  <w:style w:type="paragraph" w:styleId="Lista">
     <w:name w:val="List"/>
-    <w:basedOn w:val="BodyText"/>
-    <w:next w:val="BodyText"/>
+    <w:basedOn w:val="Textoindependiente"/>
+    <w:next w:val="Textoindependiente"/>
     <w:rsid w:val="0027116B"/>
     <w:pPr>
       <w:numPr>
@@ -3104,7 +3098,7 @@
       <w:spacing w:after="0"/>
     </w:pPr>
   </w:style>
-  <w:style w:type="paragraph" w:styleId="Caption">
+  <w:style w:type="paragraph" w:styleId="Descripcin">
     <w:name w:val="caption"/>
     <w:basedOn w:val="Normal"/>
     <w:next w:val="Normal"/>
@@ -3122,9 +3116,9 @@
       <w:szCs w:val="18"/>
     </w:rPr>
   </w:style>
-  <w:style w:type="table" w:styleId="TableGrid">
+  <w:style w:type="table" w:styleId="Tablaconcuadrcula">
     <w:name w:val="Table Grid"/>
-    <w:basedOn w:val="TableNormal"/>
+    <w:basedOn w:val="Tablanormal"/>
     <w:rsid w:val="00EF58DF"/>
     <w:pPr>
       <w:spacing w:before="240" w:after="240"/>
@@ -3150,7 +3144,7 @@
       <w:jc w:val="center"/>
     </w:pPr>
   </w:style>
-  <w:style w:type="paragraph" w:styleId="TOC1">
+  <w:style w:type="paragraph" w:styleId="TDC1">
     <w:name w:val="toc 1"/>
     <w:basedOn w:val="Normal"/>
     <w:next w:val="Normal"/>
@@ -3158,7 +3152,7 @@
     <w:semiHidden/>
     <w:rsid w:val="00B3713E"/>
   </w:style>
-  <w:style w:type="paragraph" w:styleId="TOC2">
+  <w:style w:type="paragraph" w:styleId="TDC2">
     <w:name w:val="toc 2"/>
     <w:basedOn w:val="Normal"/>
     <w:next w:val="Normal"/>
@@ -3169,7 +3163,7 @@
       <w:ind w:left="240"/>
     </w:pPr>
   </w:style>
-  <w:style w:type="paragraph" w:styleId="TOC3">
+  <w:style w:type="paragraph" w:styleId="TDC3">
     <w:name w:val="toc 3"/>
     <w:basedOn w:val="Normal"/>
     <w:next w:val="Normal"/>
@@ -3180,7 +3174,7 @@
       <w:ind w:left="480"/>
     </w:pPr>
   </w:style>
-  <w:style w:type="character" w:styleId="Hyperlink">
+  <w:style w:type="character" w:styleId="Hipervnculo">
     <w:name w:val="Hyperlink"/>
     <w:rsid w:val="00B3713E"/>
     <w:rPr>
@@ -3188,7 +3182,7 @@
       <w:u w:val="single"/>
     </w:rPr>
   </w:style>
-  <w:style w:type="paragraph" w:styleId="DocumentMap">
+  <w:style w:type="paragraph" w:styleId="Mapadeldocumento">
     <w:name w:val="Document Map"/>
     <w:basedOn w:val="Normal"/>
     <w:semiHidden/>
@@ -3200,7 +3194,7 @@
       <w:rFonts w:ascii="Tahoma" w:hAnsi="Tahoma" w:cs="Tahoma"/>
     </w:rPr>
   </w:style>
-  <w:style w:type="character" w:styleId="CommentReference">
+  <w:style w:type="character" w:styleId="Refdecomentario">
     <w:name w:val="annotation reference"/>
     <w:semiHidden/>
     <w:rsid w:val="002967AE"/>
@@ -3209,7 +3203,7 @@
       <w:szCs w:val="16"/>
     </w:rPr>
   </w:style>
-  <w:style w:type="paragraph" w:styleId="CommentText">
+  <w:style w:type="paragraph" w:styleId="Textocomentario">
     <w:name w:val="annotation text"/>
     <w:basedOn w:val="Normal"/>
     <w:semiHidden/>
@@ -3218,10 +3212,10 @@
       <w:sz w:val="20"/>
     </w:rPr>
   </w:style>
-  <w:style w:type="paragraph" w:styleId="CommentSubject">
+  <w:style w:type="paragraph" w:styleId="Asuntodelcomentario">
     <w:name w:val="annotation subject"/>
-    <w:basedOn w:val="CommentText"/>
-    <w:next w:val="CommentText"/>
+    <w:basedOn w:val="Textocomentario"/>
+    <w:next w:val="Textocomentario"/>
     <w:semiHidden/>
     <w:rsid w:val="002967AE"/>
     <w:rPr>
@@ -3229,7 +3223,7 @@
       <w:bCs/>
     </w:rPr>
   </w:style>
-  <w:style w:type="paragraph" w:styleId="BalloonText">
+  <w:style w:type="paragraph" w:styleId="Textodeglobo">
     <w:name w:val="Balloon Text"/>
     <w:basedOn w:val="Normal"/>
     <w:semiHidden/>
@@ -3240,9 +3234,9 @@
       <w:szCs w:val="16"/>
     </w:rPr>
   </w:style>
-  <w:style w:type="character" w:customStyle="1" w:styleId="FooterChar">
-    <w:name w:val="Footer Char"/>
-    <w:link w:val="Footer"/>
+  <w:style w:type="character" w:customStyle="1" w:styleId="PiedepginaCar">
+    <w:name w:val="Pie de página Car"/>
+    <w:link w:val="Piedepgina"/>
     <w:uiPriority w:val="99"/>
     <w:rsid w:val="00242CFA"/>
     <w:rPr>
@@ -3549,6 +3543,19 @@
 </file>
 
 <file path=customXml/item1.xml><?xml version="1.0" encoding="utf-8"?>
+<LongProperties xmlns="http://schemas.microsoft.com/office/2006/metadata/longProperties"/>
+</file>
+
+<file path=customXml/item2.xml><?xml version="1.0" encoding="utf-8"?>
+<?mso-contentType ?>
+<FormTemplates xmlns="http://schemas.microsoft.com/sharepoint/v3/contenttype/forms">
+  <Display>DocumentLibraryForm</Display>
+  <Edit>DocumentLibraryForm</Edit>
+  <New>DocumentLibraryForm</New>
+</FormTemplates>
+</file>
+
+<file path=customXml/item3.xml><?xml version="1.0" encoding="utf-8"?>
 <ct:contentTypeSchema xmlns:ct="http://schemas.microsoft.com/office/2006/metadata/contentType" xmlns:ma="http://schemas.microsoft.com/office/2006/metadata/properties/metaAttributes" ct:_="" ma:_="" ma:contentTypeName="Document" ma:contentTypeID="0x0101009EB496C08DAE1E4792BCB520C527A294" ma:contentTypeVersion="18" ma:contentTypeDescription="Create a new document." ma:contentTypeScope="" ma:versionID="f58bb6df52ce31facc6af1ae7599759a">
   <xsd:schema xmlns:xsd="http://www.w3.org/2001/XMLSchema" xmlns:xs="http://www.w3.org/2001/XMLSchema" xmlns:p="http://schemas.microsoft.com/office/2006/metadata/properties" xmlns:ns2="688f75fd-8c97-41b8-885e-8aea2f6a00ca" xmlns:ns3="eb539923-acac-4a68-813d-22805dc086c8" targetNamespace="http://schemas.microsoft.com/office/2006/metadata/properties" ma:root="true" ma:fieldsID="f75cb6630f7e0a71166280b4fb5f68cf" ns2:_="" ns3:_="">
     <xsd:import namespace="688f75fd-8c97-41b8-885e-8aea2f6a00ca"/>
@@ -3797,20 +3804,11 @@
 </ct:contentTypeSchema>
 </file>
 
-<file path=customXml/item2.xml><?xml version="1.0" encoding="utf-8"?>
-<?mso-contentType ?>
-<FormTemplates xmlns="http://schemas.microsoft.com/sharepoint/v3/contenttype/forms">
-  <Display>DocumentLibraryForm</Display>
-  <Edit>DocumentLibraryForm</Edit>
-  <New>DocumentLibraryForm</New>
-</FormTemplates>
+<file path=customXml/item4.xml><?xml version="1.0" encoding="utf-8"?>
+<b:Sources xmlns:b="http://schemas.openxmlformats.org/officeDocument/2006/bibliography" xmlns="http://schemas.openxmlformats.org/officeDocument/2006/bibliography" SelectedStyle="\APA.XSL" StyleName="APA"/>
 </file>
 
-<file path=customXml/item3.xml><?xml version="1.0" encoding="utf-8"?>
-<LongProperties xmlns="http://schemas.microsoft.com/office/2006/metadata/longProperties"/>
-</file>
-
-<file path=customXml/item4.xml><?xml version="1.0" encoding="utf-8"?>
+<file path=customXml/item5.xml><?xml version="1.0" encoding="utf-8"?>
 <p:properties xmlns:p="http://schemas.microsoft.com/office/2006/metadata/properties" xmlns:xsi="http://www.w3.org/2001/XMLSchema-instance" xmlns:pc="http://schemas.microsoft.com/office/infopath/2007/PartnerControls">
   <documentManagement>
     <TaxCatchAll xmlns="eb539923-acac-4a68-813d-22805dc086c8" xsi:nil="true"/>
@@ -3821,11 +3819,23 @@
 </p:properties>
 </file>
 
-<file path=customXml/item5.xml><?xml version="1.0" encoding="utf-8"?>
-<b:Sources xmlns:b="http://schemas.openxmlformats.org/officeDocument/2006/bibliography" xmlns="http://schemas.openxmlformats.org/officeDocument/2006/bibliography" SelectedStyle="\APA.XSL" StyleName="APA"/>
+<file path=customXml/itemProps1.xml><?xml version="1.0" encoding="utf-8"?>
+<ds:datastoreItem xmlns:ds="http://schemas.openxmlformats.org/officeDocument/2006/customXml" ds:itemID="{1D62ADE8-C734-4452-9470-0E8B4CA3F6A9}">
+  <ds:schemaRefs>
+    <ds:schemaRef ds:uri="http://schemas.microsoft.com/office/2006/metadata/longProperties"/>
+  </ds:schemaRefs>
+</ds:datastoreItem>
 </file>
 
-<file path=customXml/itemProps1.xml><?xml version="1.0" encoding="utf-8"?>
+<file path=customXml/itemProps2.xml><?xml version="1.0" encoding="utf-8"?>
+<ds:datastoreItem xmlns:ds="http://schemas.openxmlformats.org/officeDocument/2006/customXml" ds:itemID="{78ADCAA9-3277-4515-BBD5-3E9385DB0470}">
+  <ds:schemaRefs>
+    <ds:schemaRef ds:uri="http://schemas.microsoft.com/sharepoint/v3/contenttype/forms"/>
+  </ds:schemaRefs>
+</ds:datastoreItem>
+</file>
+
+<file path=customXml/itemProps3.xml><?xml version="1.0" encoding="utf-8"?>
 <ds:datastoreItem xmlns:ds="http://schemas.openxmlformats.org/officeDocument/2006/customXml" ds:itemID="{57A465C2-CB92-4BE1-9FF3-8C0D07A6038D}">
   <ds:schemaRefs>
     <ds:schemaRef ds:uri="http://schemas.microsoft.com/office/2006/metadata/contentType"/>
@@ -3844,23 +3854,15 @@
 </ds:datastoreItem>
 </file>
 
-<file path=customXml/itemProps2.xml><?xml version="1.0" encoding="utf-8"?>
-<ds:datastoreItem xmlns:ds="http://schemas.openxmlformats.org/officeDocument/2006/customXml" ds:itemID="{78ADCAA9-3277-4515-BBD5-3E9385DB0470}">
+<file path=customXml/itemProps4.xml><?xml version="1.0" encoding="utf-8"?>
+<ds:datastoreItem xmlns:ds="http://schemas.openxmlformats.org/officeDocument/2006/customXml" ds:itemID="{D23F5D7D-106B-470D-A3EB-DB83EBC2F651}">
   <ds:schemaRefs>
-    <ds:schemaRef ds:uri="http://schemas.microsoft.com/sharepoint/v3/contenttype/forms"/>
+    <ds:schemaRef ds:uri="http://schemas.openxmlformats.org/officeDocument/2006/bibliography"/>
   </ds:schemaRefs>
 </ds:datastoreItem>
 </file>
 
-<file path=customXml/itemProps3.xml><?xml version="1.0" encoding="utf-8"?>
-<ds:datastoreItem xmlns:ds="http://schemas.openxmlformats.org/officeDocument/2006/customXml" ds:itemID="{1D62ADE8-C734-4452-9470-0E8B4CA3F6A9}">
-  <ds:schemaRefs>
-    <ds:schemaRef ds:uri="http://schemas.microsoft.com/office/2006/metadata/longProperties"/>
-  </ds:schemaRefs>
-</ds:datastoreItem>
-</file>
-
-<file path=customXml/itemProps4.xml><?xml version="1.0" encoding="utf-8"?>
+<file path=customXml/itemProps5.xml><?xml version="1.0" encoding="utf-8"?>
 <ds:datastoreItem xmlns:ds="http://schemas.openxmlformats.org/officeDocument/2006/customXml" ds:itemID="{7AE3C1EB-CBB7-4F60-8CFA-417199EE669D}">
   <ds:schemaRefs>
     <ds:schemaRef ds:uri="http://schemas.microsoft.com/office/2006/metadata/properties"/>
@@ -3869,12 +3871,4 @@
     <ds:schemaRef ds:uri="688f75fd-8c97-41b8-885e-8aea2f6a00ca"/>
   </ds:schemaRefs>
 </ds:datastoreItem>
-</file>
-
-<file path=customXml/itemProps5.xml><?xml version="1.0" encoding="utf-8"?>
-<ds:datastoreItem xmlns:ds="http://schemas.openxmlformats.org/officeDocument/2006/customXml" ds:itemID="{D23F5D7D-106B-470D-A3EB-DB83EBC2F651}">
-  <ds:schemaRefs>
-    <ds:schemaRef ds:uri="http://schemas.openxmlformats.org/officeDocument/2006/bibliography"/>
-  </ds:schemaRefs>
-</ds:datastoreItem>
 </file>
</xml_diff>

<commit_message>
feat(factset): integrate FactSet financial data, rebuild gold panels, and finalize Chapter 5 event studies
- Integrate FactSet data pipeline: verified CUSIP identifier mapping, FQL price/market cap parsers, standardized fundamentals, and historical EPS consensus.
- Build automated validation suite reconciling FactSet extracts against gold prices, beta, and fundamentals.
- Standardize source naming conventions across FactSet and earnings call transcript manifests.
- Rebuild gold financial and market panels with point-in-time filing dates and aligned post-call event study windows.
</commit_message>
<xml_diff>
--- a/thesis_document/cover.docx
+++ b/thesis_document/cover.docx
@@ -33,6 +33,340 @@
             <v:path o:extrusionok="f" gradientshapeok="t" o:connecttype="rect"/>
             <o:lock v:ext="edit" aspectratio="t"/>
           </v:shapetype>
+          <v:shape id="_x0000_i1026" type="#_x0000_t75" alt="" style="width:153.65pt;height:58.5pt;mso-width-percent:0;mso-height-percent:0;mso-width-percent:0;mso-height-percent:0">
+            <v:imagedata r:id="rId12" o:title="new_logo_MIB"/>
+          </v:shape>
+        </w:pict>
+      </w:r>
+    </w:p>
+    <w:p/>
+    <w:p/>
+    <w:p/>
+    <w:p>
+      <w:pPr>
+        <w:spacing w:before="0" w:after="0"/>
+        <w:contextualSpacing/>
+        <w:rPr>
+          <w:b/>
+          <w:color w:val="00897B"/>
+          <w:sz w:val="52"/>
+          <w:lang w:val="en-US"/>
+        </w:rPr>
+      </w:pPr>
+      <w:r>
+        <w:rPr>
+          <w:b/>
+          <w:color w:val="00897B"/>
+          <w:sz w:val="52"/>
+          <w:lang w:val="en-US"/>
+        </w:rPr>
+        <w:t>M</w:t>
+      </w:r>
+      <w:r>
+        <w:rPr>
+          <w:b/>
+          <w:color w:val="00897B"/>
+          <w:sz w:val="52"/>
+          <w:lang w:val="en-US"/>
+        </w:rPr>
+        <w:t>BA in International Business</w:t>
+      </w:r>
+    </w:p>
+    <w:p>
+      <w:pPr>
+        <w:spacing w:before="0" w:after="0"/>
+        <w:contextualSpacing/>
+        <w:rPr>
+          <w:sz w:val="36"/>
+          <w:lang w:val="en-US"/>
+        </w:rPr>
+      </w:pPr>
+      <w:r>
+        <w:rPr>
+          <w:sz w:val="36"/>
+          <w:lang w:val="en-US"/>
+        </w:rPr>
+        <w:t>X</w:t>
+      </w:r>
+      <w:r>
+        <w:rPr>
+          <w:sz w:val="36"/>
+          <w:lang w:val="en-US"/>
+        </w:rPr>
+        <w:t>X</w:t>
+      </w:r>
+      <w:r>
+        <w:rPr>
+          <w:sz w:val="36"/>
+          <w:lang w:val="en-US"/>
+        </w:rPr>
+        <w:t>X</w:t>
+      </w:r>
+      <w:r>
+        <w:rPr>
+          <w:sz w:val="36"/>
+          <w:lang w:val="en-US"/>
+        </w:rPr>
+        <w:t>V</w:t>
+      </w:r>
+      <w:r>
+        <w:rPr>
+          <w:sz w:val="36"/>
+          <w:lang w:val="en-US"/>
+        </w:rPr>
+        <w:t>I</w:t>
+      </w:r>
+      <w:r>
+        <w:rPr>
+          <w:sz w:val="36"/>
+          <w:lang w:val="en-US"/>
+        </w:rPr>
+        <w:t xml:space="preserve"> </w:t>
+      </w:r>
+      <w:r>
+        <w:rPr>
+          <w:sz w:val="36"/>
+          <w:lang w:val="en-US"/>
+        </w:rPr>
+        <w:t>edition</w:t>
+      </w:r>
+    </w:p>
+    <w:p>
+      <w:pPr>
+        <w:spacing w:before="0" w:after="0"/>
+        <w:contextualSpacing/>
+        <w:rPr>
+          <w:sz w:val="36"/>
+          <w:lang w:val="en-US"/>
+        </w:rPr>
+      </w:pPr>
+    </w:p>
+    <w:p>
+      <w:pPr>
+        <w:spacing w:before="0" w:after="0"/>
+        <w:contextualSpacing/>
+        <w:rPr>
+          <w:sz w:val="36"/>
+          <w:lang w:val="en-US"/>
+        </w:rPr>
+      </w:pPr>
+    </w:p>
+    <w:p>
+      <w:pPr>
+        <w:spacing w:before="0" w:after="0"/>
+        <w:contextualSpacing/>
+        <w:rPr>
+          <w:sz w:val="36"/>
+          <w:lang w:val="en-US"/>
+        </w:rPr>
+      </w:pPr>
+      <w:r>
+        <w:rPr>
+          <w:sz w:val="36"/>
+          <w:lang w:val="en-US"/>
+        </w:rPr>
+        <w:t>FINAL REPORT</w:t>
+      </w:r>
+    </w:p>
+    <w:p>
+      <w:pPr>
+        <w:spacing w:before="0" w:after="0"/>
+        <w:contextualSpacing/>
+        <w:rPr>
+          <w:b/>
+          <w:i/>
+          <w:iCs/>
+          <w:sz w:val="36"/>
+          <w:lang w:val="en-US"/>
+        </w:rPr>
+      </w:pPr>
+      <w:r>
+        <w:rPr>
+          <w:b/>
+          <w:i/>
+          <w:iCs/>
+          <w:sz w:val="52"/>
+          <w:lang w:val="en-US"/>
+        </w:rPr>
+        <w:t>AI Washing or Credible Disclosure? Patterns and Clusters in Corporate AI Disclosures</w:t>
+      </w:r>
+    </w:p>
+    <w:p>
+      <w:pPr>
+        <w:spacing w:before="0" w:after="0"/>
+        <w:contextualSpacing/>
+        <w:rPr>
+          <w:sz w:val="36"/>
+          <w:lang w:val="en-US"/>
+        </w:rPr>
+      </w:pPr>
+    </w:p>
+    <w:p>
+      <w:pPr>
+        <w:spacing w:before="0" w:after="0"/>
+        <w:contextualSpacing/>
+        <w:rPr>
+          <w:sz w:val="36"/>
+          <w:lang w:val="en-US"/>
+        </w:rPr>
+      </w:pPr>
+      <w:r>
+        <w:rPr>
+          <w:sz w:val="36"/>
+          <w:lang w:val="en-US"/>
+        </w:rPr>
+        <w:t>By</w:t>
+      </w:r>
+    </w:p>
+    <w:p>
+      <w:pPr>
+        <w:spacing w:before="0" w:after="0"/>
+        <w:contextualSpacing/>
+        <w:rPr>
+          <w:i/>
+          <w:iCs/>
+          <w:sz w:val="36"/>
+          <w:lang w:val="en-US"/>
+        </w:rPr>
+      </w:pPr>
+      <w:r>
+        <w:rPr>
+          <w:i/>
+          <w:iCs/>
+          <w:sz w:val="36"/>
+          <w:lang w:val="en-US"/>
+        </w:rPr>
+        <w:t>Germán Oviedo</w:t>
+      </w:r>
+    </w:p>
+    <w:p>
+      <w:pPr>
+        <w:spacing w:before="0" w:after="0"/>
+        <w:contextualSpacing/>
+        <w:rPr>
+          <w:sz w:val="36"/>
+          <w:lang w:val="en-US"/>
+        </w:rPr>
+      </w:pPr>
+    </w:p>
+    <w:p>
+      <w:pPr>
+        <w:spacing w:before="0" w:after="0"/>
+        <w:contextualSpacing/>
+        <w:rPr>
+          <w:sz w:val="36"/>
+          <w:lang w:val="en-US"/>
+        </w:rPr>
+      </w:pPr>
+    </w:p>
+    <w:p>
+      <w:pPr>
+        <w:pBdr>
+          <w:top w:val="single" w:sz="4" w:space="1" w:color="00897B"/>
+        </w:pBdr>
+        <w:spacing w:before="0" w:after="0"/>
+        <w:contextualSpacing/>
+        <w:rPr>
+          <w:sz w:val="32"/>
+          <w:szCs w:val="32"/>
+          <w:lang w:val="en-US"/>
+        </w:rPr>
+      </w:pPr>
+    </w:p>
+    <w:p>
+      <w:pPr>
+        <w:pBdr>
+          <w:top w:val="single" w:sz="4" w:space="1" w:color="00897B"/>
+        </w:pBdr>
+        <w:spacing w:before="0" w:after="0"/>
+        <w:contextualSpacing/>
+        <w:rPr>
+          <w:sz w:val="32"/>
+          <w:szCs w:val="32"/>
+          <w:lang w:val="en-US"/>
+        </w:rPr>
+      </w:pPr>
+      <w:r>
+        <w:rPr>
+          <w:sz w:val="32"/>
+          <w:szCs w:val="32"/>
+          <w:lang w:val="en-US"/>
+        </w:rPr>
+        <w:t xml:space="preserve">I declare that this assignment is my own work, which all sources of reference are acknowledged in </w:t>
+      </w:r>
+      <w:r>
+        <w:rPr>
+          <w:sz w:val="32"/>
+          <w:szCs w:val="32"/>
+          <w:lang w:val="en-US"/>
+        </w:rPr>
+        <w:t>full,</w:t>
+      </w:r>
+      <w:r>
+        <w:rPr>
+          <w:sz w:val="32"/>
+          <w:szCs w:val="32"/>
+          <w:lang w:val="en-US"/>
+        </w:rPr>
+        <w:t xml:space="preserve"> and it has not been submitted for any other course.</w:t>
+      </w:r>
+    </w:p>
+    <w:p>
+      <w:pPr>
+        <w:rPr>
+          <w:sz w:val="32"/>
+          <w:szCs w:val="32"/>
+          <w:lang w:val="en-US"/>
+        </w:rPr>
+      </w:pPr>
+    </w:p>
+    <w:p>
+      <w:pPr>
+        <w:rPr>
+          <w:sz w:val="32"/>
+          <w:szCs w:val="32"/>
+          <w:lang w:val="en-US"/>
+        </w:rPr>
+      </w:pPr>
+    </w:p>
+    <w:p>
+      <w:pPr>
+        <w:rPr>
+          <w:sz w:val="32"/>
+          <w:szCs w:val="32"/>
+          <w:lang w:val="en-US"/>
+        </w:rPr>
+      </w:pPr>
+      <w:r>
+        <w:rPr>
+          <w:sz w:val="32"/>
+          <w:szCs w:val="32"/>
+          <w:lang w:val="en-US"/>
+        </w:rPr>
+        <w:t>Signature:</w:t>
+      </w:r>
+      <w:bookmarkEnd w:id="0"/>
+    </w:p>
+    <w:p>
+      <w:pPr>
+        <w:rPr>
+          <w:lang w:val="en-US"/>
+        </w:rPr>
+      </w:pPr>
+      <w:r>
+        <w:rPr>
+          <w:sz w:val="32"/>
+          <w:szCs w:val="32"/>
+          <w:lang w:val="en-US"/>
+        </w:rPr>
+        <w:br w:type="page"/>
+      </w:r>
+      <w:r>
+        <w:rPr>
+          <w:noProof/>
+        </w:rPr>
+        <w:lastRenderedPageBreak/>
+        <w:pict w14:anchorId="3ED7302E">
           <v:shape id="_x0000_i1025" type="#_x0000_t75" alt="" style="width:153.65pt;height:58.5pt;mso-width-percent:0;mso-height-percent:0;mso-width-percent:0;mso-height-percent:0">
             <v:imagedata r:id="rId12" o:title="new_logo_MIB"/>
           </v:shape>
@@ -86,42 +420,14 @@
           <w:sz w:val="36"/>
           <w:lang w:val="en-US"/>
         </w:rPr>
-        <w:t>X</w:t>
+        <w:t>XXXV</w:t>
       </w:r>
       <w:r>
         <w:rPr>
           <w:sz w:val="36"/>
           <w:lang w:val="en-US"/>
         </w:rPr>
-        <w:t>X</w:t>
-      </w:r>
-      <w:r>
-        <w:rPr>
-          <w:sz w:val="36"/>
-          <w:lang w:val="en-US"/>
-        </w:rPr>
-        <w:t>X</w:t>
-      </w:r>
-      <w:r>
-        <w:rPr>
-          <w:sz w:val="36"/>
-          <w:lang w:val="en-US"/>
-        </w:rPr>
-        <w:t>V</w:t>
-      </w:r>
-      <w:r>
-        <w:rPr>
-          <w:sz w:val="36"/>
-          <w:lang w:val="en-US"/>
-        </w:rPr>
-        <w:t>I</w:t>
-      </w:r>
-      <w:r>
-        <w:rPr>
-          <w:sz w:val="36"/>
-          <w:lang w:val="en-US"/>
-        </w:rPr>
-        <w:t xml:space="preserve"> </w:t>
+        <w:t xml:space="preserve">I </w:t>
       </w:r>
       <w:r>
         <w:rPr>
@@ -267,85 +573,83 @@
         <w:spacing w:before="0" w:after="0"/>
         <w:contextualSpacing/>
         <w:rPr>
-          <w:sz w:val="32"/>
-          <w:szCs w:val="32"/>
-          <w:lang w:val="en-US"/>
-        </w:rPr>
-      </w:pPr>
-    </w:p>
-    <w:p>
-      <w:pPr>
-        <w:pBdr>
-          <w:top w:val="single" w:sz="4" w:space="1" w:color="00897B"/>
-        </w:pBdr>
-        <w:spacing w:before="0" w:after="0"/>
-        <w:contextualSpacing/>
-        <w:rPr>
-          <w:sz w:val="32"/>
-          <w:szCs w:val="32"/>
+          <w:sz w:val="36"/>
           <w:lang w:val="en-US"/>
         </w:rPr>
       </w:pPr>
       <w:r>
         <w:rPr>
-          <w:sz w:val="32"/>
-          <w:szCs w:val="32"/>
-          <w:lang w:val="en-US"/>
-        </w:rPr>
-        <w:t xml:space="preserve">I declare that this assignment is my own work, which all sources of reference are acknowledged in </w:t>
-      </w:r>
-      <w:r>
-        <w:rPr>
-          <w:sz w:val="32"/>
-          <w:szCs w:val="32"/>
-          <w:lang w:val="en-US"/>
-        </w:rPr>
-        <w:t>full,</w:t>
-      </w:r>
-      <w:r>
-        <w:rPr>
-          <w:sz w:val="32"/>
-          <w:szCs w:val="32"/>
-          <w:lang w:val="en-US"/>
-        </w:rPr>
-        <w:t xml:space="preserve"> and it has not been submitted for any other course.</w:t>
+          <w:sz w:val="36"/>
+          <w:lang w:val="en-US"/>
+        </w:rPr>
+        <w:t>DISCUSSANT:</w:t>
       </w:r>
     </w:p>
     <w:p>
       <w:pPr>
+        <w:spacing w:before="0" w:after="0"/>
+        <w:contextualSpacing/>
+        <w:rPr>
+          <w:i/>
+          <w:iCs/>
+          <w:sz w:val="36"/>
+          <w:lang w:val="en-US"/>
+        </w:rPr>
+      </w:pPr>
+      <w:r>
+        <w:rPr>
+          <w:i/>
+          <w:iCs/>
+          <w:sz w:val="36"/>
+          <w:lang w:val="en-US"/>
+        </w:rPr>
+        <w:t>Francesco Venier</w:t>
+      </w:r>
+    </w:p>
+    <w:p>
+      <w:pPr>
+        <w:spacing w:before="0" w:after="0"/>
+        <w:contextualSpacing/>
+        <w:rPr>
+          <w:sz w:val="36"/>
+          <w:lang w:val="en-US"/>
+        </w:rPr>
+      </w:pPr>
+    </w:p>
+    <w:p>
+      <w:pPr>
+        <w:pStyle w:val="TDC1"/>
+        <w:tabs>
+          <w:tab w:val="right" w:leader="dot" w:pos="8493"/>
+        </w:tabs>
+        <w:rPr>
+          <w:lang w:val="en-US"/>
+        </w:rPr>
+      </w:pPr>
+      <w:r>
+        <w:fldChar w:fldCharType="begin"/>
+      </w:r>
+      <w:r>
+        <w:rPr>
+          <w:lang w:val="en-US"/>
+        </w:rPr>
+        <w:instrText xml:space="preserve"> TOC \o "1-3" \h \z \u </w:instrText>
+      </w:r>
+      <w:r>
+        <w:fldChar w:fldCharType="separate"/>
+      </w:r>
+      <w:r>
+        <w:fldChar w:fldCharType="end"/>
+      </w:r>
+    </w:p>
+    <w:p>
+      <w:pPr>
         <w:rPr>
           <w:sz w:val="32"/>
           <w:szCs w:val="32"/>
           <w:lang w:val="en-US"/>
         </w:rPr>
       </w:pPr>
-    </w:p>
-    <w:p>
-      <w:pPr>
-        <w:rPr>
-          <w:sz w:val="32"/>
-          <w:szCs w:val="32"/>
-          <w:lang w:val="en-US"/>
-        </w:rPr>
-      </w:pPr>
-    </w:p>
-    <w:p>
-      <w:pPr>
-        <w:rPr>
-          <w:sz w:val="32"/>
-          <w:szCs w:val="32"/>
-          <w:lang w:val="en-US"/>
-        </w:rPr>
-      </w:pPr>
-      <w:r>
-        <w:rPr>
-          <w:sz w:val="32"/>
-          <w:szCs w:val="32"/>
-          <w:lang w:val="en-US"/>
-        </w:rPr>
-        <w:t>Signature:</w:t>
-      </w:r>
-      <w:bookmarkEnd w:id="0"/>
     </w:p>
     <w:sectPr>
       <w:headerReference w:type="even" r:id="rId13"/>
@@ -445,6 +749,7 @@
       <w:fldChar w:fldCharType="end"/>
     </w:r>
   </w:p>
+  <w:p/>
 </w:ftr>
 </file>
 
@@ -503,6 +808,7 @@
       <w:fldChar w:fldCharType="end"/>
     </w:r>
   </w:p>
+  <w:p/>
 </w:ftr>
 </file>
 
@@ -559,6 +865,7 @@
       <w:t>MIB TRIESTE SCHOOL OF MANAGEMENT</w:t>
     </w:r>
   </w:p>
+  <w:p/>
 </w:hdr>
 </file>
 
@@ -580,6 +887,7 @@
       <w:t>MIB TRIESTE SCHOOL OF MANAGEMENT</w:t>
     </w:r>
   </w:p>
+  <w:p/>
 </w:hdr>
 </file>
 
@@ -3543,19 +3851,6 @@
 </file>
 
 <file path=customXml/item1.xml><?xml version="1.0" encoding="utf-8"?>
-<LongProperties xmlns="http://schemas.microsoft.com/office/2006/metadata/longProperties"/>
-</file>
-
-<file path=customXml/item2.xml><?xml version="1.0" encoding="utf-8"?>
-<?mso-contentType ?>
-<FormTemplates xmlns="http://schemas.microsoft.com/sharepoint/v3/contenttype/forms">
-  <Display>DocumentLibraryForm</Display>
-  <Edit>DocumentLibraryForm</Edit>
-  <New>DocumentLibraryForm</New>
-</FormTemplates>
-</file>
-
-<file path=customXml/item3.xml><?xml version="1.0" encoding="utf-8"?>
 <ct:contentTypeSchema xmlns:ct="http://schemas.microsoft.com/office/2006/metadata/contentType" xmlns:ma="http://schemas.microsoft.com/office/2006/metadata/properties/metaAttributes" ct:_="" ma:_="" ma:contentTypeName="Document" ma:contentTypeID="0x0101009EB496C08DAE1E4792BCB520C527A294" ma:contentTypeVersion="18" ma:contentTypeDescription="Create a new document." ma:contentTypeScope="" ma:versionID="f58bb6df52ce31facc6af1ae7599759a">
   <xsd:schema xmlns:xsd="http://www.w3.org/2001/XMLSchema" xmlns:xs="http://www.w3.org/2001/XMLSchema" xmlns:p="http://schemas.microsoft.com/office/2006/metadata/properties" xmlns:ns2="688f75fd-8c97-41b8-885e-8aea2f6a00ca" xmlns:ns3="eb539923-acac-4a68-813d-22805dc086c8" targetNamespace="http://schemas.microsoft.com/office/2006/metadata/properties" ma:root="true" ma:fieldsID="f75cb6630f7e0a71166280b4fb5f68cf" ns2:_="" ns3:_="">
     <xsd:import namespace="688f75fd-8c97-41b8-885e-8aea2f6a00ca"/>
@@ -3804,11 +4099,20 @@
 </ct:contentTypeSchema>
 </file>
 
-<file path=customXml/item4.xml><?xml version="1.0" encoding="utf-8"?>
-<b:Sources xmlns:b="http://schemas.openxmlformats.org/officeDocument/2006/bibliography" xmlns="http://schemas.openxmlformats.org/officeDocument/2006/bibliography" SelectedStyle="\APA.XSL" StyleName="APA"/>
+<file path=customXml/item2.xml><?xml version="1.0" encoding="utf-8"?>
+<?mso-contentType ?>
+<FormTemplates xmlns="http://schemas.microsoft.com/sharepoint/v3/contenttype/forms">
+  <Display>DocumentLibraryForm</Display>
+  <Edit>DocumentLibraryForm</Edit>
+  <New>DocumentLibraryForm</New>
+</FormTemplates>
 </file>
 
-<file path=customXml/item5.xml><?xml version="1.0" encoding="utf-8"?>
+<file path=customXml/item3.xml><?xml version="1.0" encoding="utf-8"?>
+<LongProperties xmlns="http://schemas.microsoft.com/office/2006/metadata/longProperties"/>
+</file>
+
+<file path=customXml/item4.xml><?xml version="1.0" encoding="utf-8"?>
 <p:properties xmlns:p="http://schemas.microsoft.com/office/2006/metadata/properties" xmlns:xsi="http://www.w3.org/2001/XMLSchema-instance" xmlns:pc="http://schemas.microsoft.com/office/infopath/2007/PartnerControls">
   <documentManagement>
     <TaxCatchAll xmlns="eb539923-acac-4a68-813d-22805dc086c8" xsi:nil="true"/>
@@ -3819,23 +4123,11 @@
 </p:properties>
 </file>
 
-<file path=customXml/itemProps1.xml><?xml version="1.0" encoding="utf-8"?>
-<ds:datastoreItem xmlns:ds="http://schemas.openxmlformats.org/officeDocument/2006/customXml" ds:itemID="{1D62ADE8-C734-4452-9470-0E8B4CA3F6A9}">
-  <ds:schemaRefs>
-    <ds:schemaRef ds:uri="http://schemas.microsoft.com/office/2006/metadata/longProperties"/>
-  </ds:schemaRefs>
-</ds:datastoreItem>
+<file path=customXml/item5.xml><?xml version="1.0" encoding="utf-8"?>
+<b:Sources xmlns:b="http://schemas.openxmlformats.org/officeDocument/2006/bibliography" xmlns="http://schemas.openxmlformats.org/officeDocument/2006/bibliography" SelectedStyle="\APA.XSL" StyleName="APA"/>
 </file>
 
-<file path=customXml/itemProps2.xml><?xml version="1.0" encoding="utf-8"?>
-<ds:datastoreItem xmlns:ds="http://schemas.openxmlformats.org/officeDocument/2006/customXml" ds:itemID="{78ADCAA9-3277-4515-BBD5-3E9385DB0470}">
-  <ds:schemaRefs>
-    <ds:schemaRef ds:uri="http://schemas.microsoft.com/sharepoint/v3/contenttype/forms"/>
-  </ds:schemaRefs>
-</ds:datastoreItem>
-</file>
-
-<file path=customXml/itemProps3.xml><?xml version="1.0" encoding="utf-8"?>
+<file path=customXml/itemProps1.xml><?xml version="1.0" encoding="utf-8"?>
 <ds:datastoreItem xmlns:ds="http://schemas.openxmlformats.org/officeDocument/2006/customXml" ds:itemID="{57A465C2-CB92-4BE1-9FF3-8C0D07A6038D}">
   <ds:schemaRefs>
     <ds:schemaRef ds:uri="http://schemas.microsoft.com/office/2006/metadata/contentType"/>
@@ -3854,15 +4146,23 @@
 </ds:datastoreItem>
 </file>
 
-<file path=customXml/itemProps4.xml><?xml version="1.0" encoding="utf-8"?>
-<ds:datastoreItem xmlns:ds="http://schemas.openxmlformats.org/officeDocument/2006/customXml" ds:itemID="{D23F5D7D-106B-470D-A3EB-DB83EBC2F651}">
+<file path=customXml/itemProps2.xml><?xml version="1.0" encoding="utf-8"?>
+<ds:datastoreItem xmlns:ds="http://schemas.openxmlformats.org/officeDocument/2006/customXml" ds:itemID="{78ADCAA9-3277-4515-BBD5-3E9385DB0470}">
   <ds:schemaRefs>
-    <ds:schemaRef ds:uri="http://schemas.openxmlformats.org/officeDocument/2006/bibliography"/>
+    <ds:schemaRef ds:uri="http://schemas.microsoft.com/sharepoint/v3/contenttype/forms"/>
   </ds:schemaRefs>
 </ds:datastoreItem>
 </file>
 
-<file path=customXml/itemProps5.xml><?xml version="1.0" encoding="utf-8"?>
+<file path=customXml/itemProps3.xml><?xml version="1.0" encoding="utf-8"?>
+<ds:datastoreItem xmlns:ds="http://schemas.openxmlformats.org/officeDocument/2006/customXml" ds:itemID="{1D62ADE8-C734-4452-9470-0E8B4CA3F6A9}">
+  <ds:schemaRefs>
+    <ds:schemaRef ds:uri="http://schemas.microsoft.com/office/2006/metadata/longProperties"/>
+  </ds:schemaRefs>
+</ds:datastoreItem>
+</file>
+
+<file path=customXml/itemProps4.xml><?xml version="1.0" encoding="utf-8"?>
 <ds:datastoreItem xmlns:ds="http://schemas.openxmlformats.org/officeDocument/2006/customXml" ds:itemID="{7AE3C1EB-CBB7-4F60-8CFA-417199EE669D}">
   <ds:schemaRefs>
     <ds:schemaRef ds:uri="http://schemas.microsoft.com/office/2006/metadata/properties"/>
@@ -3871,4 +4171,12 @@
     <ds:schemaRef ds:uri="688f75fd-8c97-41b8-885e-8aea2f6a00ca"/>
   </ds:schemaRefs>
 </ds:datastoreItem>
+</file>
+
+<file path=customXml/itemProps5.xml><?xml version="1.0" encoding="utf-8"?>
+<ds:datastoreItem xmlns:ds="http://schemas.openxmlformats.org/officeDocument/2006/customXml" ds:itemID="{D23F5D7D-106B-470D-A3EB-DB83EBC2F651}">
+  <ds:schemaRefs>
+    <ds:schemaRef ds:uri="http://schemas.openxmlformats.org/officeDocument/2006/bibliography"/>
+  </ds:schemaRefs>
+</ds:datastoreItem>
 </file>
</xml_diff>

<commit_message>
docs(thesis): finalize manuscript, document pipeline architecture, and integrate Hugging Face hub
- Final narrative and structural polish across Chapters 1-6 and Appendices A-F, aligning executive summary directly with empirical findings.
- Restructure Chapter 6 around decision stages (diagnose, design, govern) and generate final thesis documents (Word docx and PDF).
- Comprehensive root and apps documentation: translate validator to English and provide step-by-step replication guide.
- Integrate Hugging Face Hub dataset and models (mrbungie/ai-disclosure-analysis) with automatic sync and download recipes.
- Neutralize commercial transcript vendor names across codebase and manuscript citations.
</commit_message>
<xml_diff>
--- a/thesis_document/cover.docx
+++ b/thesis_document/cover.docx
@@ -8,12 +8,11 @@
           <w:lang w:val="en-US"/>
         </w:rPr>
       </w:pPr>
-      <w:bookmarkStart w:id="0" w:name="_Toc43964939"/>
       <w:r>
         <w:rPr>
           <w:noProof/>
         </w:rPr>
-        <w:pict w14:anchorId="4D4DD1D5">
+        <w:pict w14:anchorId="3ED7302E">
           <v:shapetype id="_x0000_t75" coordsize="21600,21600" o:spt="75" o:preferrelative="t" path="m@4@5l@4@11@9@11@9@5xe" filled="f" stroked="f">
             <v:stroke joinstyle="miter"/>
             <v:formulas>
@@ -33,340 +32,6 @@
             <v:path o:extrusionok="f" gradientshapeok="t" o:connecttype="rect"/>
             <o:lock v:ext="edit" aspectratio="t"/>
           </v:shapetype>
-          <v:shape id="_x0000_i1026" type="#_x0000_t75" alt="" style="width:153.65pt;height:58.5pt;mso-width-percent:0;mso-height-percent:0;mso-width-percent:0;mso-height-percent:0">
-            <v:imagedata r:id="rId12" o:title="new_logo_MIB"/>
-          </v:shape>
-        </w:pict>
-      </w:r>
-    </w:p>
-    <w:p/>
-    <w:p/>
-    <w:p/>
-    <w:p>
-      <w:pPr>
-        <w:spacing w:before="0" w:after="0"/>
-        <w:contextualSpacing/>
-        <w:rPr>
-          <w:b/>
-          <w:color w:val="00897B"/>
-          <w:sz w:val="52"/>
-          <w:lang w:val="en-US"/>
-        </w:rPr>
-      </w:pPr>
-      <w:r>
-        <w:rPr>
-          <w:b/>
-          <w:color w:val="00897B"/>
-          <w:sz w:val="52"/>
-          <w:lang w:val="en-US"/>
-        </w:rPr>
-        <w:t>M</w:t>
-      </w:r>
-      <w:r>
-        <w:rPr>
-          <w:b/>
-          <w:color w:val="00897B"/>
-          <w:sz w:val="52"/>
-          <w:lang w:val="en-US"/>
-        </w:rPr>
-        <w:t>BA in International Business</w:t>
-      </w:r>
-    </w:p>
-    <w:p>
-      <w:pPr>
-        <w:spacing w:before="0" w:after="0"/>
-        <w:contextualSpacing/>
-        <w:rPr>
-          <w:sz w:val="36"/>
-          <w:lang w:val="en-US"/>
-        </w:rPr>
-      </w:pPr>
-      <w:r>
-        <w:rPr>
-          <w:sz w:val="36"/>
-          <w:lang w:val="en-US"/>
-        </w:rPr>
-        <w:t>X</w:t>
-      </w:r>
-      <w:r>
-        <w:rPr>
-          <w:sz w:val="36"/>
-          <w:lang w:val="en-US"/>
-        </w:rPr>
-        <w:t>X</w:t>
-      </w:r>
-      <w:r>
-        <w:rPr>
-          <w:sz w:val="36"/>
-          <w:lang w:val="en-US"/>
-        </w:rPr>
-        <w:t>X</w:t>
-      </w:r>
-      <w:r>
-        <w:rPr>
-          <w:sz w:val="36"/>
-          <w:lang w:val="en-US"/>
-        </w:rPr>
-        <w:t>V</w:t>
-      </w:r>
-      <w:r>
-        <w:rPr>
-          <w:sz w:val="36"/>
-          <w:lang w:val="en-US"/>
-        </w:rPr>
-        <w:t>I</w:t>
-      </w:r>
-      <w:r>
-        <w:rPr>
-          <w:sz w:val="36"/>
-          <w:lang w:val="en-US"/>
-        </w:rPr>
-        <w:t xml:space="preserve"> </w:t>
-      </w:r>
-      <w:r>
-        <w:rPr>
-          <w:sz w:val="36"/>
-          <w:lang w:val="en-US"/>
-        </w:rPr>
-        <w:t>edition</w:t>
-      </w:r>
-    </w:p>
-    <w:p>
-      <w:pPr>
-        <w:spacing w:before="0" w:after="0"/>
-        <w:contextualSpacing/>
-        <w:rPr>
-          <w:sz w:val="36"/>
-          <w:lang w:val="en-US"/>
-        </w:rPr>
-      </w:pPr>
-    </w:p>
-    <w:p>
-      <w:pPr>
-        <w:spacing w:before="0" w:after="0"/>
-        <w:contextualSpacing/>
-        <w:rPr>
-          <w:sz w:val="36"/>
-          <w:lang w:val="en-US"/>
-        </w:rPr>
-      </w:pPr>
-    </w:p>
-    <w:p>
-      <w:pPr>
-        <w:spacing w:before="0" w:after="0"/>
-        <w:contextualSpacing/>
-        <w:rPr>
-          <w:sz w:val="36"/>
-          <w:lang w:val="en-US"/>
-        </w:rPr>
-      </w:pPr>
-      <w:r>
-        <w:rPr>
-          <w:sz w:val="36"/>
-          <w:lang w:val="en-US"/>
-        </w:rPr>
-        <w:t>FINAL REPORT</w:t>
-      </w:r>
-    </w:p>
-    <w:p>
-      <w:pPr>
-        <w:spacing w:before="0" w:after="0"/>
-        <w:contextualSpacing/>
-        <w:rPr>
-          <w:b/>
-          <w:i/>
-          <w:iCs/>
-          <w:sz w:val="36"/>
-          <w:lang w:val="en-US"/>
-        </w:rPr>
-      </w:pPr>
-      <w:r>
-        <w:rPr>
-          <w:b/>
-          <w:i/>
-          <w:iCs/>
-          <w:sz w:val="52"/>
-          <w:lang w:val="en-US"/>
-        </w:rPr>
-        <w:t>AI Washing or Credible Disclosure? Patterns and Clusters in Corporate AI Disclosures</w:t>
-      </w:r>
-    </w:p>
-    <w:p>
-      <w:pPr>
-        <w:spacing w:before="0" w:after="0"/>
-        <w:contextualSpacing/>
-        <w:rPr>
-          <w:sz w:val="36"/>
-          <w:lang w:val="en-US"/>
-        </w:rPr>
-      </w:pPr>
-    </w:p>
-    <w:p>
-      <w:pPr>
-        <w:spacing w:before="0" w:after="0"/>
-        <w:contextualSpacing/>
-        <w:rPr>
-          <w:sz w:val="36"/>
-          <w:lang w:val="en-US"/>
-        </w:rPr>
-      </w:pPr>
-      <w:r>
-        <w:rPr>
-          <w:sz w:val="36"/>
-          <w:lang w:val="en-US"/>
-        </w:rPr>
-        <w:t>By</w:t>
-      </w:r>
-    </w:p>
-    <w:p>
-      <w:pPr>
-        <w:spacing w:before="0" w:after="0"/>
-        <w:contextualSpacing/>
-        <w:rPr>
-          <w:i/>
-          <w:iCs/>
-          <w:sz w:val="36"/>
-          <w:lang w:val="en-US"/>
-        </w:rPr>
-      </w:pPr>
-      <w:r>
-        <w:rPr>
-          <w:i/>
-          <w:iCs/>
-          <w:sz w:val="36"/>
-          <w:lang w:val="en-US"/>
-        </w:rPr>
-        <w:t>Germán Oviedo</w:t>
-      </w:r>
-    </w:p>
-    <w:p>
-      <w:pPr>
-        <w:spacing w:before="0" w:after="0"/>
-        <w:contextualSpacing/>
-        <w:rPr>
-          <w:sz w:val="36"/>
-          <w:lang w:val="en-US"/>
-        </w:rPr>
-      </w:pPr>
-    </w:p>
-    <w:p>
-      <w:pPr>
-        <w:spacing w:before="0" w:after="0"/>
-        <w:contextualSpacing/>
-        <w:rPr>
-          <w:sz w:val="36"/>
-          <w:lang w:val="en-US"/>
-        </w:rPr>
-      </w:pPr>
-    </w:p>
-    <w:p>
-      <w:pPr>
-        <w:pBdr>
-          <w:top w:val="single" w:sz="4" w:space="1" w:color="00897B"/>
-        </w:pBdr>
-        <w:spacing w:before="0" w:after="0"/>
-        <w:contextualSpacing/>
-        <w:rPr>
-          <w:sz w:val="32"/>
-          <w:szCs w:val="32"/>
-          <w:lang w:val="en-US"/>
-        </w:rPr>
-      </w:pPr>
-    </w:p>
-    <w:p>
-      <w:pPr>
-        <w:pBdr>
-          <w:top w:val="single" w:sz="4" w:space="1" w:color="00897B"/>
-        </w:pBdr>
-        <w:spacing w:before="0" w:after="0"/>
-        <w:contextualSpacing/>
-        <w:rPr>
-          <w:sz w:val="32"/>
-          <w:szCs w:val="32"/>
-          <w:lang w:val="en-US"/>
-        </w:rPr>
-      </w:pPr>
-      <w:r>
-        <w:rPr>
-          <w:sz w:val="32"/>
-          <w:szCs w:val="32"/>
-          <w:lang w:val="en-US"/>
-        </w:rPr>
-        <w:t xml:space="preserve">I declare that this assignment is my own work, which all sources of reference are acknowledged in </w:t>
-      </w:r>
-      <w:r>
-        <w:rPr>
-          <w:sz w:val="32"/>
-          <w:szCs w:val="32"/>
-          <w:lang w:val="en-US"/>
-        </w:rPr>
-        <w:t>full,</w:t>
-      </w:r>
-      <w:r>
-        <w:rPr>
-          <w:sz w:val="32"/>
-          <w:szCs w:val="32"/>
-          <w:lang w:val="en-US"/>
-        </w:rPr>
-        <w:t xml:space="preserve"> and it has not been submitted for any other course.</w:t>
-      </w:r>
-    </w:p>
-    <w:p>
-      <w:pPr>
-        <w:rPr>
-          <w:sz w:val="32"/>
-          <w:szCs w:val="32"/>
-          <w:lang w:val="en-US"/>
-        </w:rPr>
-      </w:pPr>
-    </w:p>
-    <w:p>
-      <w:pPr>
-        <w:rPr>
-          <w:sz w:val="32"/>
-          <w:szCs w:val="32"/>
-          <w:lang w:val="en-US"/>
-        </w:rPr>
-      </w:pPr>
-    </w:p>
-    <w:p>
-      <w:pPr>
-        <w:rPr>
-          <w:sz w:val="32"/>
-          <w:szCs w:val="32"/>
-          <w:lang w:val="en-US"/>
-        </w:rPr>
-      </w:pPr>
-      <w:r>
-        <w:rPr>
-          <w:sz w:val="32"/>
-          <w:szCs w:val="32"/>
-          <w:lang w:val="en-US"/>
-        </w:rPr>
-        <w:t>Signature:</w:t>
-      </w:r>
-      <w:bookmarkEnd w:id="0"/>
-    </w:p>
-    <w:p>
-      <w:pPr>
-        <w:rPr>
-          <w:lang w:val="en-US"/>
-        </w:rPr>
-      </w:pPr>
-      <w:r>
-        <w:rPr>
-          <w:sz w:val="32"/>
-          <w:szCs w:val="32"/>
-          <w:lang w:val="en-US"/>
-        </w:rPr>
-        <w:br w:type="page"/>
-      </w:r>
-      <w:r>
-        <w:rPr>
-          <w:noProof/>
-        </w:rPr>
-        <w:lastRenderedPageBreak/>
-        <w:pict w14:anchorId="3ED7302E">
           <v:shape id="_x0000_i1025" type="#_x0000_t75" alt="" style="width:153.65pt;height:58.5pt;mso-width-percent:0;mso-height-percent:0;mso-width-percent:0;mso-height-percent:0">
             <v:imagedata r:id="rId12" o:title="new_logo_MIB"/>
           </v:shape>
@@ -513,13 +178,11 @@
         <w:contextualSpacing/>
         <w:rPr>
           <w:sz w:val="36"/>
-          <w:lang w:val="en-US"/>
         </w:rPr>
       </w:pPr>
       <w:r>
         <w:rPr>
           <w:sz w:val="36"/>
-          <w:lang w:val="en-US"/>
         </w:rPr>
         <w:t>By</w:t>
       </w:r>
@@ -532,7 +195,6 @@
           <w:i/>
           <w:iCs/>
           <w:sz w:val="36"/>
-          <w:lang w:val="en-US"/>
         </w:rPr>
       </w:pPr>
       <w:r>
@@ -540,7 +202,6 @@
           <w:i/>
           <w:iCs/>
           <w:sz w:val="36"/>
-          <w:lang w:val="en-US"/>
         </w:rPr>
         <w:t>Germán Oviedo</w:t>
       </w:r>
@@ -551,7 +212,6 @@
         <w:contextualSpacing/>
         <w:rPr>
           <w:sz w:val="36"/>
-          <w:lang w:val="en-US"/>
         </w:rPr>
       </w:pPr>
     </w:p>
@@ -561,7 +221,6 @@
         <w:contextualSpacing/>
         <w:rPr>
           <w:sz w:val="36"/>
-          <w:lang w:val="en-US"/>
         </w:rPr>
       </w:pPr>
     </w:p>
@@ -574,13 +233,11 @@
         <w:contextualSpacing/>
         <w:rPr>
           <w:sz w:val="36"/>
-          <w:lang w:val="en-US"/>
         </w:rPr>
       </w:pPr>
       <w:r>
         <w:rPr>
           <w:sz w:val="36"/>
-          <w:lang w:val="en-US"/>
         </w:rPr>
         <w:t>DISCUSSANT:</w:t>
       </w:r>
@@ -593,7 +250,6 @@
           <w:i/>
           <w:iCs/>
           <w:sz w:val="36"/>
-          <w:lang w:val="en-US"/>
         </w:rPr>
       </w:pPr>
       <w:r>
@@ -601,53 +257,15 @@
           <w:i/>
           <w:iCs/>
           <w:sz w:val="36"/>
-          <w:lang w:val="en-US"/>
         </w:rPr>
         <w:t>Francesco Venier</w:t>
       </w:r>
     </w:p>
     <w:p>
       <w:pPr>
-        <w:spacing w:before="0" w:after="0"/>
-        <w:contextualSpacing/>
-        <w:rPr>
-          <w:sz w:val="36"/>
-          <w:lang w:val="en-US"/>
-        </w:rPr>
-      </w:pPr>
-    </w:p>
-    <w:p>
-      <w:pPr>
-        <w:pStyle w:val="TDC1"/>
-        <w:tabs>
-          <w:tab w:val="right" w:leader="dot" w:pos="8493"/>
-        </w:tabs>
-        <w:rPr>
-          <w:lang w:val="en-US"/>
-        </w:rPr>
-      </w:pPr>
-      <w:r>
-        <w:fldChar w:fldCharType="begin"/>
-      </w:r>
-      <w:r>
-        <w:rPr>
-          <w:lang w:val="en-US"/>
-        </w:rPr>
-        <w:instrText xml:space="preserve"> TOC \o "1-3" \h \z \u </w:instrText>
-      </w:r>
-      <w:r>
-        <w:fldChar w:fldCharType="separate"/>
-      </w:r>
-      <w:r>
-        <w:fldChar w:fldCharType="end"/>
-      </w:r>
-    </w:p>
-    <w:p>
-      <w:pPr>
         <w:rPr>
           <w:sz w:val="32"/>
           <w:szCs w:val="32"/>
-          <w:lang w:val="en-US"/>
         </w:rPr>
       </w:pPr>
     </w:p>
@@ -3851,6 +3469,30 @@
 </file>
 
 <file path=customXml/item1.xml><?xml version="1.0" encoding="utf-8"?>
+<p:properties xmlns:p="http://schemas.microsoft.com/office/2006/metadata/properties" xmlns:xsi="http://www.w3.org/2001/XMLSchema-instance" xmlns:pc="http://schemas.microsoft.com/office/infopath/2007/PartnerControls">
+  <documentManagement>
+    <TaxCatchAll xmlns="eb539923-acac-4a68-813d-22805dc086c8" xsi:nil="true"/>
+    <lcf76f155ced4ddcb4097134ff3c332f xmlns="688f75fd-8c97-41b8-885e-8aea2f6a00ca">
+      <Terms xmlns="http://schemas.microsoft.com/office/infopath/2007/PartnerControls"/>
+    </lcf76f155ced4ddcb4097134ff3c332f>
+  </documentManagement>
+</p:properties>
+</file>
+
+<file path=customXml/item2.xml><?xml version="1.0" encoding="utf-8"?>
+<LongProperties xmlns="http://schemas.microsoft.com/office/2006/metadata/longProperties"/>
+</file>
+
+<file path=customXml/item3.xml><?xml version="1.0" encoding="utf-8"?>
+<?mso-contentType ?>
+<FormTemplates xmlns="http://schemas.microsoft.com/sharepoint/v3/contenttype/forms">
+  <Display>DocumentLibraryForm</Display>
+  <Edit>DocumentLibraryForm</Edit>
+  <New>DocumentLibraryForm</New>
+</FormTemplates>
+</file>
+
+<file path=customXml/item4.xml><?xml version="1.0" encoding="utf-8"?>
 <ct:contentTypeSchema xmlns:ct="http://schemas.microsoft.com/office/2006/metadata/contentType" xmlns:ma="http://schemas.microsoft.com/office/2006/metadata/properties/metaAttributes" ct:_="" ma:_="" ma:contentTypeName="Document" ma:contentTypeID="0x0101009EB496C08DAE1E4792BCB520C527A294" ma:contentTypeVersion="18" ma:contentTypeDescription="Create a new document." ma:contentTypeScope="" ma:versionID="f58bb6df52ce31facc6af1ae7599759a">
   <xsd:schema xmlns:xsd="http://www.w3.org/2001/XMLSchema" xmlns:xs="http://www.w3.org/2001/XMLSchema" xmlns:p="http://schemas.microsoft.com/office/2006/metadata/properties" xmlns:ns2="688f75fd-8c97-41b8-885e-8aea2f6a00ca" xmlns:ns3="eb539923-acac-4a68-813d-22805dc086c8" targetNamespace="http://schemas.microsoft.com/office/2006/metadata/properties" ma:root="true" ma:fieldsID="f75cb6630f7e0a71166280b4fb5f68cf" ns2:_="" ns3:_="">
     <xsd:import namespace="688f75fd-8c97-41b8-885e-8aea2f6a00ca"/>
@@ -4099,35 +3741,38 @@
 </ct:contentTypeSchema>
 </file>
 
-<file path=customXml/item2.xml><?xml version="1.0" encoding="utf-8"?>
-<?mso-contentType ?>
-<FormTemplates xmlns="http://schemas.microsoft.com/sharepoint/v3/contenttype/forms">
-  <Display>DocumentLibraryForm</Display>
-  <Edit>DocumentLibraryForm</Edit>
-  <New>DocumentLibraryForm</New>
-</FormTemplates>
-</file>
-
-<file path=customXml/item3.xml><?xml version="1.0" encoding="utf-8"?>
-<LongProperties xmlns="http://schemas.microsoft.com/office/2006/metadata/longProperties"/>
-</file>
-
-<file path=customXml/item4.xml><?xml version="1.0" encoding="utf-8"?>
-<p:properties xmlns:p="http://schemas.microsoft.com/office/2006/metadata/properties" xmlns:xsi="http://www.w3.org/2001/XMLSchema-instance" xmlns:pc="http://schemas.microsoft.com/office/infopath/2007/PartnerControls">
-  <documentManagement>
-    <TaxCatchAll xmlns="eb539923-acac-4a68-813d-22805dc086c8" xsi:nil="true"/>
-    <lcf76f155ced4ddcb4097134ff3c332f xmlns="688f75fd-8c97-41b8-885e-8aea2f6a00ca">
-      <Terms xmlns="http://schemas.microsoft.com/office/infopath/2007/PartnerControls"/>
-    </lcf76f155ced4ddcb4097134ff3c332f>
-  </documentManagement>
-</p:properties>
-</file>
-
 <file path=customXml/item5.xml><?xml version="1.0" encoding="utf-8"?>
 <b:Sources xmlns:b="http://schemas.openxmlformats.org/officeDocument/2006/bibliography" xmlns="http://schemas.openxmlformats.org/officeDocument/2006/bibliography" SelectedStyle="\APA.XSL" StyleName="APA"/>
 </file>
 
 <file path=customXml/itemProps1.xml><?xml version="1.0" encoding="utf-8"?>
+<ds:datastoreItem xmlns:ds="http://schemas.openxmlformats.org/officeDocument/2006/customXml" ds:itemID="{7AE3C1EB-CBB7-4F60-8CFA-417199EE669D}">
+  <ds:schemaRefs>
+    <ds:schemaRef ds:uri="http://schemas.microsoft.com/office/2006/metadata/properties"/>
+    <ds:schemaRef ds:uri="http://schemas.microsoft.com/office/infopath/2007/PartnerControls"/>
+    <ds:schemaRef ds:uri="eb539923-acac-4a68-813d-22805dc086c8"/>
+    <ds:schemaRef ds:uri="688f75fd-8c97-41b8-885e-8aea2f6a00ca"/>
+  </ds:schemaRefs>
+</ds:datastoreItem>
+</file>
+
+<file path=customXml/itemProps2.xml><?xml version="1.0" encoding="utf-8"?>
+<ds:datastoreItem xmlns:ds="http://schemas.openxmlformats.org/officeDocument/2006/customXml" ds:itemID="{1D62ADE8-C734-4452-9470-0E8B4CA3F6A9}">
+  <ds:schemaRefs>
+    <ds:schemaRef ds:uri="http://schemas.microsoft.com/office/2006/metadata/longProperties"/>
+  </ds:schemaRefs>
+</ds:datastoreItem>
+</file>
+
+<file path=customXml/itemProps3.xml><?xml version="1.0" encoding="utf-8"?>
+<ds:datastoreItem xmlns:ds="http://schemas.openxmlformats.org/officeDocument/2006/customXml" ds:itemID="{78ADCAA9-3277-4515-BBD5-3E9385DB0470}">
+  <ds:schemaRefs>
+    <ds:schemaRef ds:uri="http://schemas.microsoft.com/sharepoint/v3/contenttype/forms"/>
+  </ds:schemaRefs>
+</ds:datastoreItem>
+</file>
+
+<file path=customXml/itemProps4.xml><?xml version="1.0" encoding="utf-8"?>
 <ds:datastoreItem xmlns:ds="http://schemas.openxmlformats.org/officeDocument/2006/customXml" ds:itemID="{57A465C2-CB92-4BE1-9FF3-8C0D07A6038D}">
   <ds:schemaRefs>
     <ds:schemaRef ds:uri="http://schemas.microsoft.com/office/2006/metadata/contentType"/>
@@ -4146,33 +3791,6 @@
 </ds:datastoreItem>
 </file>
 
-<file path=customXml/itemProps2.xml><?xml version="1.0" encoding="utf-8"?>
-<ds:datastoreItem xmlns:ds="http://schemas.openxmlformats.org/officeDocument/2006/customXml" ds:itemID="{78ADCAA9-3277-4515-BBD5-3E9385DB0470}">
-  <ds:schemaRefs>
-    <ds:schemaRef ds:uri="http://schemas.microsoft.com/sharepoint/v3/contenttype/forms"/>
-  </ds:schemaRefs>
-</ds:datastoreItem>
-</file>
-
-<file path=customXml/itemProps3.xml><?xml version="1.0" encoding="utf-8"?>
-<ds:datastoreItem xmlns:ds="http://schemas.openxmlformats.org/officeDocument/2006/customXml" ds:itemID="{1D62ADE8-C734-4452-9470-0E8B4CA3F6A9}">
-  <ds:schemaRefs>
-    <ds:schemaRef ds:uri="http://schemas.microsoft.com/office/2006/metadata/longProperties"/>
-  </ds:schemaRefs>
-</ds:datastoreItem>
-</file>
-
-<file path=customXml/itemProps4.xml><?xml version="1.0" encoding="utf-8"?>
-<ds:datastoreItem xmlns:ds="http://schemas.openxmlformats.org/officeDocument/2006/customXml" ds:itemID="{7AE3C1EB-CBB7-4F60-8CFA-417199EE669D}">
-  <ds:schemaRefs>
-    <ds:schemaRef ds:uri="http://schemas.microsoft.com/office/2006/metadata/properties"/>
-    <ds:schemaRef ds:uri="http://schemas.microsoft.com/office/infopath/2007/PartnerControls"/>
-    <ds:schemaRef ds:uri="eb539923-acac-4a68-813d-22805dc086c8"/>
-    <ds:schemaRef ds:uri="688f75fd-8c97-41b8-885e-8aea2f6a00ca"/>
-  </ds:schemaRefs>
-</ds:datastoreItem>
-</file>
-
 <file path=customXml/itemProps5.xml><?xml version="1.0" encoding="utf-8"?>
 <ds:datastoreItem xmlns:ds="http://schemas.openxmlformats.org/officeDocument/2006/customXml" ds:itemID="{D23F5D7D-106B-470D-A3EB-DB83EBC2F651}">
   <ds:schemaRefs>

</xml_diff>